<commit_message>
VPT voltage and temperature are displayed
</commit_message>
<xml_diff>
--- a/doc/CommandSet_Multiservo.docx
+++ b/doc/CommandSet_Multiservo.docx
@@ -53,7 +53,6 @@
         </w:rPr>
         <w:t xml:space="preserve">r </w:t>
       </w:r>
-      <w:proofErr w:type="spellStart"/>
       <w:r>
         <w:rPr>
           <w:b/>
@@ -62,9 +61,8 @@
           <w:szCs w:val="34"/>
           <w:lang w:val="en-US"/>
         </w:rPr>
-        <w:t>Multiservo</w:t>
+        <w:t>VPT</w:t>
       </w:r>
-      <w:proofErr w:type="spellEnd"/>
       <w:r>
         <w:rPr>
           <w:b/>
@@ -162,7 +160,7 @@
         <w:rPr>
           <w:b/>
           <w:bCs/>
-          <w:lang w:val="en-US"/>
+          <w:lang w:val="ru-RU"/>
         </w:rPr>
       </w:pPr>
       <w:r>
@@ -185,9 +183,9 @@
         <w:rPr>
           <w:b/>
           <w:bCs/>
-          <w:lang w:val="en-US"/>
+          <w:lang w:val="ru-RU"/>
         </w:rPr>
-        <w:t>3</w:t>
+        <w:t>4</w:t>
       </w:r>
     </w:p>
     <w:p>
@@ -1178,7 +1176,7 @@
                 <w:szCs w:val="22"/>
                 <w:lang w:val="en-US"/>
               </w:rPr>
-              <w:t>GTS</w:t>
+              <w:t>GS</w:t>
             </w:r>
           </w:p>
         </w:tc>
@@ -1194,23 +1192,25 @@
                 <w:lang w:val="en-US"/>
               </w:rPr>
             </w:pPr>
-            <w:r>
-              <w:rPr>
-                <w:sz w:val="22"/>
-                <w:szCs w:val="22"/>
-                <w:lang w:val="en-US"/>
-              </w:rPr>
-              <w:t>TS:</w:t>
-            </w:r>
-            <w:r>
-              <w:rPr>
-                <w:color w:val="FF0000"/>
-                <w:sz w:val="22"/>
-                <w:szCs w:val="22"/>
-                <w:lang w:val="en-US"/>
-              </w:rPr>
-              <w:t>xx</w:t>
-            </w:r>
+            <w:proofErr w:type="gramStart"/>
+            <w:r>
+              <w:rPr>
+                <w:sz w:val="22"/>
+                <w:szCs w:val="22"/>
+                <w:lang w:val="en-US"/>
+              </w:rPr>
+              <w:t>S:</w:t>
+            </w:r>
+            <w:r>
+              <w:rPr>
+                <w:color w:val="EE0000"/>
+                <w:sz w:val="22"/>
+                <w:szCs w:val="22"/>
+                <w:lang w:val="en-US"/>
+              </w:rPr>
+              <w:t>xxxx</w:t>
+            </w:r>
+            <w:proofErr w:type="gramEnd"/>
           </w:p>
         </w:tc>
         <w:tc>
@@ -1231,7 +1231,7 @@
                 <w:szCs w:val="22"/>
                 <w:lang w:val="en-US"/>
               </w:rPr>
-              <w:t>Get measured temperature from servo, °C</w:t>
+              <w:t>Get VPT status (see below)</w:t>
             </w:r>
           </w:p>
         </w:tc>
@@ -1258,7 +1258,7 @@
                 <w:szCs w:val="22"/>
                 <w:lang w:val="en-US"/>
               </w:rPr>
-              <w:t>GT</w:t>
+              <w:t>GTS</w:t>
             </w:r>
           </w:p>
         </w:tc>
@@ -1280,7 +1280,7 @@
                 <w:szCs w:val="22"/>
                 <w:lang w:val="en-US"/>
               </w:rPr>
-              <w:t>T:</w:t>
+              <w:t>TS:</w:t>
             </w:r>
             <w:r>
               <w:rPr>
@@ -1291,24 +1291,6 @@
               </w:rPr>
               <w:t>xx</w:t>
             </w:r>
-            <w:r>
-              <w:rPr>
-                <w:color w:val="FF0000"/>
-                <w:sz w:val="22"/>
-                <w:szCs w:val="22"/>
-                <w:lang w:val="en-US"/>
-              </w:rPr>
-              <w:t>.</w:t>
-            </w:r>
-            <w:r>
-              <w:rPr>
-                <w:color w:val="FF0000"/>
-                <w:sz w:val="22"/>
-                <w:szCs w:val="22"/>
-                <w:lang w:val="en-US"/>
-              </w:rPr>
-              <w:t>x</w:t>
-            </w:r>
           </w:p>
         </w:tc>
         <w:tc>
@@ -1329,7 +1311,7 @@
                 <w:szCs w:val="22"/>
                 <w:lang w:val="en-US"/>
               </w:rPr>
-              <w:t>Get module temperature, °C</w:t>
+              <w:t>Get measured temperature from servo, °C</w:t>
             </w:r>
           </w:p>
         </w:tc>
@@ -1356,7 +1338,7 @@
                 <w:szCs w:val="22"/>
                 <w:lang w:val="en-US"/>
               </w:rPr>
-              <w:t>GUM</w:t>
+              <w:t>GT</w:t>
             </w:r>
           </w:p>
         </w:tc>
@@ -1378,7 +1360,7 @@
                 <w:szCs w:val="22"/>
                 <w:lang w:val="en-US"/>
               </w:rPr>
-              <w:t>UM:</w:t>
+              <w:t>T:</w:t>
             </w:r>
             <w:r>
               <w:rPr>
@@ -1387,7 +1369,25 @@
                 <w:szCs w:val="22"/>
                 <w:lang w:val="en-US"/>
               </w:rPr>
-              <w:t>xx.x</w:t>
+              <w:t>xx</w:t>
+            </w:r>
+            <w:r>
+              <w:rPr>
+                <w:color w:val="FF0000"/>
+                <w:sz w:val="22"/>
+                <w:szCs w:val="22"/>
+                <w:lang w:val="en-US"/>
+              </w:rPr>
+              <w:t>.</w:t>
+            </w:r>
+            <w:r>
+              <w:rPr>
+                <w:color w:val="FF0000"/>
+                <w:sz w:val="22"/>
+                <w:szCs w:val="22"/>
+                <w:lang w:val="en-US"/>
+              </w:rPr>
+              <w:t>x</w:t>
             </w:r>
           </w:p>
         </w:tc>
@@ -1409,7 +1409,7 @@
                 <w:szCs w:val="22"/>
                 <w:lang w:val="en-US"/>
               </w:rPr>
-              <w:t>Get measured voltage from servo, V</w:t>
+              <w:t>Get module temperature, °C</w:t>
             </w:r>
           </w:p>
         </w:tc>
@@ -1436,7 +1436,7 @@
                 <w:szCs w:val="22"/>
                 <w:lang w:val="en-US"/>
               </w:rPr>
-              <w:t>GUS</w:t>
+              <w:t>GUM</w:t>
             </w:r>
           </w:p>
         </w:tc>
@@ -1458,7 +1458,7 @@
                 <w:szCs w:val="22"/>
                 <w:lang w:val="en-US"/>
               </w:rPr>
-              <w:t>US:</w:t>
+              <w:t>UM:</w:t>
             </w:r>
             <w:r>
               <w:rPr>
@@ -1489,7 +1489,7 @@
                 <w:szCs w:val="22"/>
                 <w:lang w:val="en-US"/>
               </w:rPr>
-              <w:t>Get power supply voltage, V</w:t>
+              <w:t>Get measured voltage from servo, V</w:t>
             </w:r>
           </w:p>
         </w:tc>
@@ -1516,6 +1516,86 @@
                 <w:szCs w:val="22"/>
                 <w:lang w:val="en-US"/>
               </w:rPr>
+              <w:t>GUS</w:t>
+            </w:r>
+          </w:p>
+        </w:tc>
+        <w:tc>
+          <w:tcPr>
+            <w:tcW w:w="2268" w:type="dxa"/>
+          </w:tcPr>
+          <w:p>
+            <w:pPr>
+              <w:rPr>
+                <w:sz w:val="22"/>
+                <w:szCs w:val="22"/>
+                <w:lang w:val="en-US"/>
+              </w:rPr>
+            </w:pPr>
+            <w:r>
+              <w:rPr>
+                <w:sz w:val="22"/>
+                <w:szCs w:val="22"/>
+                <w:lang w:val="en-US"/>
+              </w:rPr>
+              <w:t>US:</w:t>
+            </w:r>
+            <w:r>
+              <w:rPr>
+                <w:color w:val="FF0000"/>
+                <w:sz w:val="22"/>
+                <w:szCs w:val="22"/>
+                <w:lang w:val="en-US"/>
+              </w:rPr>
+              <w:t>xx.x</w:t>
+            </w:r>
+          </w:p>
+        </w:tc>
+        <w:tc>
+          <w:tcPr>
+            <w:tcW w:w="5358" w:type="dxa"/>
+          </w:tcPr>
+          <w:p>
+            <w:pPr>
+              <w:rPr>
+                <w:sz w:val="22"/>
+                <w:szCs w:val="22"/>
+                <w:lang w:val="en-US"/>
+              </w:rPr>
+            </w:pPr>
+            <w:r>
+              <w:rPr>
+                <w:sz w:val="22"/>
+                <w:szCs w:val="22"/>
+                <w:lang w:val="en-US"/>
+              </w:rPr>
+              <w:t>Get power supply voltage, V</w:t>
+            </w:r>
+          </w:p>
+        </w:tc>
+      </w:tr>
+      <w:tr>
+        <w:trPr>
+          <w:trHeight w:val="240"/>
+        </w:trPr>
+        <w:tc>
+          <w:tcPr>
+            <w:tcW w:w="2439" w:type="dxa"/>
+          </w:tcPr>
+          <w:p>
+            <w:pPr>
+              <w:rPr>
+                <w:sz w:val="22"/>
+                <w:szCs w:val="22"/>
+                <w:lang w:val="en-US"/>
+              </w:rPr>
+            </w:pPr>
+            <w:r>
+              <w:rPr>
+                <w:sz w:val="22"/>
+                <w:szCs w:val="22"/>
+                <w:lang w:val="en-US"/>
+              </w:rPr>
               <w:t>GU</w:t>
             </w:r>
           </w:p>
@@ -1587,6 +1667,210 @@
               </w:rPr>
               <w:t xml:space="preserve"> voltage, V</w:t>
             </w:r>
+          </w:p>
+        </w:tc>
+      </w:tr>
+      <w:tr>
+        <w:trPr>
+          <w:trHeight w:val="240"/>
+        </w:trPr>
+        <w:tc>
+          <w:tcPr>
+            <w:tcW w:w="2439" w:type="dxa"/>
+          </w:tcPr>
+          <w:p>
+            <w:pPr>
+              <w:rPr>
+                <w:sz w:val="22"/>
+                <w:szCs w:val="22"/>
+              </w:rPr>
+            </w:pPr>
+            <w:r>
+              <w:rPr>
+                <w:sz w:val="22"/>
+                <w:szCs w:val="22"/>
+              </w:rPr>
+              <w:t>GVS</w:t>
+            </w:r>
+          </w:p>
+        </w:tc>
+        <w:tc>
+          <w:tcPr>
+            <w:tcW w:w="2268" w:type="dxa"/>
+          </w:tcPr>
+          <w:p>
+            <w:pPr>
+              <w:rPr>
+                <w:sz w:val="22"/>
+                <w:szCs w:val="22"/>
+                <w:lang w:val="en-US"/>
+              </w:rPr>
+            </w:pPr>
+            <w:proofErr w:type="spellStart"/>
+            <w:proofErr w:type="gramStart"/>
+            <w:r>
+              <w:rPr>
+                <w:sz w:val="22"/>
+                <w:szCs w:val="22"/>
+                <w:lang w:val="en-US"/>
+              </w:rPr>
+              <w:t>VS:</w:t>
+            </w:r>
+            <w:r>
+              <w:rPr>
+                <w:color w:val="EE0000"/>
+                <w:sz w:val="22"/>
+                <w:szCs w:val="22"/>
+                <w:lang w:val="en-US"/>
+              </w:rPr>
+              <w:t>xxxxxxxxxxx</w:t>
+            </w:r>
+            <w:proofErr w:type="spellEnd"/>
+            <w:proofErr w:type="gramEnd"/>
+          </w:p>
+        </w:tc>
+        <w:tc>
+          <w:tcPr>
+            <w:tcW w:w="5358" w:type="dxa"/>
+          </w:tcPr>
+          <w:p>
+            <w:pPr>
+              <w:rPr>
+                <w:sz w:val="22"/>
+                <w:szCs w:val="22"/>
+                <w:lang w:val="en-US"/>
+              </w:rPr>
+            </w:pPr>
+            <w:r>
+              <w:rPr>
+                <w:sz w:val="22"/>
+                <w:szCs w:val="22"/>
+                <w:lang w:val="en-US"/>
+              </w:rPr>
+              <w:t>Get version string (RS485, CAN)</w:t>
+            </w:r>
+          </w:p>
+        </w:tc>
+      </w:tr>
+      <w:tr>
+        <w:trPr>
+          <w:trHeight w:val="240"/>
+        </w:trPr>
+        <w:tc>
+          <w:tcPr>
+            <w:tcW w:w="2439" w:type="dxa"/>
+          </w:tcPr>
+          <w:p>
+            <w:pPr>
+              <w:rPr>
+                <w:sz w:val="22"/>
+                <w:szCs w:val="22"/>
+              </w:rPr>
+            </w:pPr>
+            <w:r>
+              <w:rPr>
+                <w:sz w:val="22"/>
+                <w:szCs w:val="22"/>
+              </w:rPr>
+              <w:t>GWT</w:t>
+            </w:r>
+          </w:p>
+        </w:tc>
+        <w:tc>
+          <w:tcPr>
+            <w:tcW w:w="2268" w:type="dxa"/>
+          </w:tcPr>
+          <w:p>
+            <w:pPr>
+              <w:rPr>
+                <w:sz w:val="22"/>
+                <w:szCs w:val="22"/>
+                <w:lang w:val="en-US"/>
+              </w:rPr>
+            </w:pPr>
+            <w:proofErr w:type="spellStart"/>
+            <w:proofErr w:type="gramStart"/>
+            <w:r>
+              <w:rPr>
+                <w:sz w:val="22"/>
+                <w:szCs w:val="22"/>
+                <w:lang w:val="en-US"/>
+              </w:rPr>
+              <w:t>WT:</w:t>
+            </w:r>
+            <w:r>
+              <w:rPr>
+                <w:color w:val="EE0000"/>
+                <w:sz w:val="22"/>
+                <w:szCs w:val="22"/>
+                <w:lang w:val="en-US"/>
+              </w:rPr>
+              <w:t>xxxx</w:t>
+            </w:r>
+            <w:proofErr w:type="gramEnd"/>
+            <w:r>
+              <w:rPr>
+                <w:color w:val="EE0000"/>
+                <w:sz w:val="22"/>
+                <w:szCs w:val="22"/>
+                <w:lang w:val="en-US"/>
+              </w:rPr>
+              <w:t>:</w:t>
+            </w:r>
+            <w:proofErr w:type="gramStart"/>
+            <w:r>
+              <w:rPr>
+                <w:color w:val="EE0000"/>
+                <w:sz w:val="22"/>
+                <w:szCs w:val="22"/>
+                <w:lang w:val="en-US"/>
+              </w:rPr>
+              <w:t>xx:xx</w:t>
+            </w:r>
+            <w:proofErr w:type="spellEnd"/>
+            <w:proofErr w:type="gramEnd"/>
+          </w:p>
+        </w:tc>
+        <w:tc>
+          <w:tcPr>
+            <w:tcW w:w="5358" w:type="dxa"/>
+          </w:tcPr>
+          <w:p>
+            <w:pPr>
+              <w:rPr>
+                <w:sz w:val="22"/>
+                <w:szCs w:val="22"/>
+                <w:lang w:val="en-US"/>
+              </w:rPr>
+            </w:pPr>
+            <w:r>
+              <w:rPr>
+                <w:sz w:val="22"/>
+                <w:szCs w:val="22"/>
+                <w:lang w:val="en-US"/>
+              </w:rPr>
+              <w:t xml:space="preserve">Get working time, </w:t>
+            </w:r>
+            <w:proofErr w:type="spellStart"/>
+            <w:proofErr w:type="gramStart"/>
+            <w:r>
+              <w:rPr>
+                <w:sz w:val="22"/>
+                <w:szCs w:val="22"/>
+                <w:lang w:val="en-US"/>
+              </w:rPr>
+              <w:t>hours:minutes</w:t>
+            </w:r>
+            <w:proofErr w:type="gramEnd"/>
+            <w:r>
+              <w:rPr>
+                <w:sz w:val="22"/>
+                <w:szCs w:val="22"/>
+                <w:lang w:val="en-US"/>
+              </w:rPr>
+              <w:t>:seconds</w:t>
+            </w:r>
+            <w:proofErr w:type="spellEnd"/>
           </w:p>
         </w:tc>
       </w:tr>
@@ -3213,50 +3497,97 @@
         </w:trPr>
         <w:tc>
           <w:tcPr>
-            <w:tcW w:w="10065" w:type="dxa"/>
-            <w:gridSpan w:val="3"/>
-            <w:shd w:val="clear" w:color="auto" w:fill="D9D9D9" w:themeFill="background1" w:themeFillShade="D9"/>
-          </w:tcPr>
-          <w:p>
-            <w:pPr>
-              <w:jc w:val="center"/>
-              <w:rPr>
-                <w:b/>
-                <w:bCs/>
-                <w:sz w:val="22"/>
-                <w:szCs w:val="22"/>
-                <w:lang w:val="en-GB"/>
-              </w:rPr>
-            </w:pPr>
-            <w:r>
-              <w:rPr>
-                <w:b/>
-                <w:bCs/>
-                <w:sz w:val="22"/>
-                <w:szCs w:val="22"/>
-                <w:lang w:val="en-GB"/>
-              </w:rPr>
-              <w:t>Debugging</w:t>
-            </w:r>
-            <w:r>
-              <w:rPr>
-                <w:b/>
-                <w:bCs/>
-                <w:sz w:val="22"/>
-                <w:szCs w:val="22"/>
-                <w:lang w:val="en-GB"/>
-              </w:rPr>
-              <w:t xml:space="preserve"> commands</w:t>
-            </w:r>
-            <w:r>
-              <w:rPr>
-                <w:b/>
-                <w:bCs/>
-                <w:sz w:val="22"/>
-                <w:szCs w:val="22"/>
-                <w:lang w:val="en-GB"/>
-              </w:rPr>
-              <w:t xml:space="preserve"> (for internal usage only!)</w:t>
+            <w:tcW w:w="2439" w:type="dxa"/>
+          </w:tcPr>
+          <w:p>
+            <w:pPr>
+              <w:rPr>
+                <w:sz w:val="22"/>
+                <w:szCs w:val="22"/>
+                <w:lang w:val="en-US"/>
+              </w:rPr>
+            </w:pPr>
+            <w:proofErr w:type="spellStart"/>
+            <w:r>
+              <w:rPr>
+                <w:sz w:val="22"/>
+                <w:szCs w:val="22"/>
+                <w:lang w:val="en-US"/>
+              </w:rPr>
+              <w:t>RAW</w:t>
+            </w:r>
+            <w:r>
+              <w:rPr>
+                <w:color w:val="00B050"/>
+                <w:sz w:val="22"/>
+                <w:szCs w:val="22"/>
+                <w:lang w:val="en-US"/>
+              </w:rPr>
+              <w:t>xxxxxxxx</w:t>
+            </w:r>
+            <w:proofErr w:type="spellEnd"/>
+          </w:p>
+        </w:tc>
+        <w:tc>
+          <w:tcPr>
+            <w:tcW w:w="2268" w:type="dxa"/>
+          </w:tcPr>
+          <w:p>
+            <w:pPr>
+              <w:rPr>
+                <w:sz w:val="22"/>
+                <w:szCs w:val="22"/>
+                <w:lang w:val="en-US"/>
+              </w:rPr>
+            </w:pPr>
+            <w:proofErr w:type="spellStart"/>
+            <w:r>
+              <w:rPr>
+                <w:color w:val="EE0000"/>
+                <w:sz w:val="22"/>
+                <w:szCs w:val="22"/>
+                <w:lang w:val="en-US"/>
+              </w:rPr>
+              <w:t>yyyyyyyy</w:t>
+            </w:r>
+            <w:proofErr w:type="spellEnd"/>
+          </w:p>
+        </w:tc>
+        <w:tc>
+          <w:tcPr>
+            <w:tcW w:w="5358" w:type="dxa"/>
+          </w:tcPr>
+          <w:p>
+            <w:pPr>
+              <w:rPr>
+                <w:sz w:val="22"/>
+                <w:szCs w:val="22"/>
+                <w:lang w:val="en-US"/>
+              </w:rPr>
+            </w:pPr>
+            <w:r>
+              <w:rPr>
+                <w:sz w:val="22"/>
+                <w:szCs w:val="22"/>
+                <w:lang w:val="en-US"/>
+              </w:rPr>
+              <w:t>S</w:t>
+            </w:r>
+            <w:r>
+              <w:rPr>
+                <w:sz w:val="22"/>
+                <w:szCs w:val="22"/>
+                <w:lang w:val="en-US"/>
+              </w:rPr>
+              <w:t>end raw command (RS485</w:t>
+            </w:r>
+            <w:r>
+              <w:rPr>
+                <w:sz w:val="22"/>
+                <w:szCs w:val="22"/>
+                <w:lang w:val="en-US"/>
+              </w:rPr>
+              <w:t>, CAN)</w:t>
             </w:r>
           </w:p>
         </w:tc>
@@ -3267,141 +3598,50 @@
         </w:trPr>
         <w:tc>
           <w:tcPr>
-            <w:tcW w:w="2439" w:type="dxa"/>
-          </w:tcPr>
-          <w:p>
-            <w:pPr>
-              <w:rPr>
-                <w:sz w:val="22"/>
-                <w:szCs w:val="22"/>
-                <w:lang w:val="en-US"/>
-              </w:rPr>
-            </w:pPr>
-            <w:proofErr w:type="spellStart"/>
-            <w:r>
-              <w:rPr>
-                <w:sz w:val="22"/>
-                <w:szCs w:val="22"/>
-                <w:lang w:val="en-US"/>
-              </w:rPr>
-              <w:t>ADC</w:t>
-            </w:r>
-            <w:r>
-              <w:rPr>
-                <w:color w:val="00B050"/>
-                <w:sz w:val="22"/>
-                <w:szCs w:val="22"/>
-                <w:lang w:val="en-US"/>
-              </w:rPr>
-              <w:t>x</w:t>
-            </w:r>
-            <w:proofErr w:type="spellEnd"/>
-            <w:r>
-              <w:rPr>
-                <w:color w:val="00B050"/>
-                <w:sz w:val="22"/>
-                <w:szCs w:val="22"/>
-                <w:lang w:val="en-US"/>
-              </w:rPr>
-              <w:t xml:space="preserve"> </w:t>
-            </w:r>
-            <w:r>
-              <w:rPr>
-                <w:color w:val="000000" w:themeColor="text1"/>
-                <w:sz w:val="22"/>
-                <w:szCs w:val="22"/>
-                <w:lang w:val="en-US"/>
-              </w:rPr>
-              <w:t>(d</w:t>
-            </w:r>
-            <w:r>
-              <w:rPr>
-                <w:color w:val="000000" w:themeColor="text1"/>
-                <w:sz w:val="22"/>
-                <w:szCs w:val="22"/>
-                <w:lang w:val="en-US"/>
-              </w:rPr>
-              <w:t>ec</w:t>
-            </w:r>
-            <w:r>
-              <w:rPr>
-                <w:color w:val="000000" w:themeColor="text1"/>
-                <w:sz w:val="22"/>
-                <w:szCs w:val="22"/>
-                <w:lang w:val="en-US"/>
-              </w:rPr>
-              <w:t>)</w:t>
-            </w:r>
-          </w:p>
-        </w:tc>
-        <w:tc>
-          <w:tcPr>
-            <w:tcW w:w="2268" w:type="dxa"/>
-          </w:tcPr>
-          <w:p>
-            <w:pPr>
-              <w:rPr>
-                <w:sz w:val="22"/>
-                <w:szCs w:val="22"/>
-                <w:lang w:val="en-US"/>
-              </w:rPr>
-            </w:pPr>
-            <w:r>
-              <w:rPr>
-                <w:color w:val="FF0000"/>
-                <w:sz w:val="22"/>
-                <w:szCs w:val="22"/>
-                <w:lang w:val="en-US"/>
-              </w:rPr>
-              <w:t>xxx</w:t>
-            </w:r>
-          </w:p>
-        </w:tc>
-        <w:tc>
-          <w:tcPr>
-            <w:tcW w:w="5358" w:type="dxa"/>
-          </w:tcPr>
-          <w:p>
-            <w:pPr>
-              <w:rPr>
-                <w:sz w:val="22"/>
-                <w:szCs w:val="22"/>
-                <w:lang w:val="en-US"/>
-              </w:rPr>
-            </w:pPr>
-            <w:r>
-              <w:rPr>
-                <w:sz w:val="22"/>
-                <w:szCs w:val="22"/>
-                <w:lang w:val="en-US"/>
-              </w:rPr>
-              <w:t xml:space="preserve">Get raw ADC value for channel </w:t>
-            </w:r>
-            <w:r>
-              <w:rPr>
-                <w:color w:val="00B050"/>
-                <w:sz w:val="22"/>
-                <w:szCs w:val="22"/>
-                <w:lang w:val="en-US"/>
-              </w:rPr>
-              <w:t>x</w:t>
-            </w:r>
-            <w:r>
-              <w:rPr>
-                <w:color w:val="00B050"/>
-                <w:sz w:val="22"/>
-                <w:szCs w:val="22"/>
-                <w:lang w:val="en-US"/>
-              </w:rPr>
-              <w:t xml:space="preserve"> </w:t>
-            </w:r>
-            <w:r>
-              <w:rPr>
-                <w:sz w:val="22"/>
-                <w:szCs w:val="22"/>
-                <w:lang w:val="en-US"/>
-              </w:rPr>
-              <w:t>as HEX</w:t>
+            <w:tcW w:w="10065" w:type="dxa"/>
+            <w:gridSpan w:val="3"/>
+            <w:shd w:val="clear" w:color="auto" w:fill="D9D9D9" w:themeFill="background1" w:themeFillShade="D9"/>
+          </w:tcPr>
+          <w:p>
+            <w:pPr>
+              <w:jc w:val="center"/>
+              <w:rPr>
+                <w:b/>
+                <w:bCs/>
+                <w:sz w:val="22"/>
+                <w:szCs w:val="22"/>
+                <w:lang w:val="en-GB"/>
+              </w:rPr>
+            </w:pPr>
+            <w:r>
+              <w:rPr>
+                <w:b/>
+                <w:bCs/>
+                <w:sz w:val="22"/>
+                <w:szCs w:val="22"/>
+                <w:lang w:val="en-GB"/>
+              </w:rPr>
+              <w:t>Debugging</w:t>
+            </w:r>
+            <w:r>
+              <w:rPr>
+                <w:b/>
+                <w:bCs/>
+                <w:sz w:val="22"/>
+                <w:szCs w:val="22"/>
+                <w:lang w:val="en-GB"/>
+              </w:rPr>
+              <w:t xml:space="preserve"> commands</w:t>
+            </w:r>
+            <w:r>
+              <w:rPr>
+                <w:b/>
+                <w:bCs/>
+                <w:sz w:val="22"/>
+                <w:szCs w:val="22"/>
+                <w:lang w:val="en-GB"/>
+              </w:rPr>
+              <w:t xml:space="preserve"> (for internal usage only!)</w:t>
             </w:r>
           </w:p>
         </w:tc>
@@ -3429,7 +3669,7 @@
                 <w:szCs w:val="22"/>
                 <w:lang w:val="en-US"/>
               </w:rPr>
-              <w:t>DAC</w:t>
+              <w:t>ADC</w:t>
             </w:r>
             <w:r>
               <w:rPr>
@@ -3493,11 +3733,12 @@
             </w:pPr>
             <w:r>
               <w:rPr>
-                <w:sz w:val="22"/>
-                <w:szCs w:val="22"/>
-                <w:lang w:val="en-US"/>
-              </w:rPr>
-              <w:t>OK</w:t>
+                <w:color w:val="FF0000"/>
+                <w:sz w:val="22"/>
+                <w:szCs w:val="22"/>
+                <w:lang w:val="en-US"/>
+              </w:rPr>
+              <w:t>xxx</w:t>
             </w:r>
           </w:p>
         </w:tc>
@@ -3519,7 +3760,33 @@
                 <w:szCs w:val="22"/>
                 <w:lang w:val="en-US"/>
               </w:rPr>
-              <w:t>Set raw value for DAC output (used in current limiter)</w:t>
+              <w:t xml:space="preserve">Get raw ADC value for channel </w:t>
+            </w:r>
+            <w:r>
+              <w:rPr>
+                <w:color w:val="00B050"/>
+                <w:sz w:val="22"/>
+                <w:szCs w:val="22"/>
+                <w:lang w:val="en-US"/>
+              </w:rPr>
+              <w:t>x</w:t>
+            </w:r>
+            <w:r>
+              <w:rPr>
+                <w:color w:val="00B050"/>
+                <w:sz w:val="22"/>
+                <w:szCs w:val="22"/>
+                <w:lang w:val="en-US"/>
+              </w:rPr>
+              <w:t xml:space="preserve"> </w:t>
+            </w:r>
+            <w:r>
+              <w:rPr>
+                <w:sz w:val="22"/>
+                <w:szCs w:val="22"/>
+                <w:lang w:val="en-US"/>
+              </w:rPr>
+              <w:t>as HEX</w:t>
             </w:r>
           </w:p>
         </w:tc>
@@ -3531,9 +3798,6 @@
         <w:tc>
           <w:tcPr>
             <w:tcW w:w="2439" w:type="dxa"/>
-            <w:tcBorders>
-              <w:bottom w:val="single" w:sz="4" w:space="0" w:color="auto"/>
-            </w:tcBorders>
           </w:tcPr>
           <w:p>
             <w:pPr>
@@ -3544,14 +3808,13 @@
               </w:rPr>
             </w:pPr>
             <w:proofErr w:type="spellStart"/>
-            <w:proofErr w:type="gramStart"/>
-            <w:r>
-              <w:rPr>
-                <w:sz w:val="22"/>
-                <w:szCs w:val="22"/>
-                <w:lang w:val="en-US"/>
-              </w:rPr>
-              <w:t>OUT</w:t>
+            <w:r>
+              <w:rPr>
+                <w:sz w:val="22"/>
+                <w:szCs w:val="22"/>
+                <w:lang w:val="en-US"/>
+              </w:rPr>
+              <w:t>DAC</w:t>
             </w:r>
             <w:r>
               <w:rPr>
@@ -3560,32 +3823,39 @@
                 <w:szCs w:val="22"/>
                 <w:lang w:val="en-US"/>
               </w:rPr>
-              <w:t>x:y</w:t>
+              <w:t>x</w:t>
             </w:r>
             <w:proofErr w:type="spellEnd"/>
-            <w:proofErr w:type="gramEnd"/>
-            <w:r>
-              <w:rPr>
-                <w:sz w:val="22"/>
-                <w:szCs w:val="22"/>
-                <w:lang w:val="en-US"/>
-              </w:rPr>
-              <w:t xml:space="preserve"> (</w:t>
-            </w:r>
-            <w:proofErr w:type="spellStart"/>
-            <w:proofErr w:type="gramStart"/>
-            <w:r>
-              <w:rPr>
-                <w:sz w:val="22"/>
-                <w:szCs w:val="22"/>
-                <w:lang w:val="en-US"/>
-              </w:rPr>
-              <w:t>dec:dec</w:t>
-            </w:r>
-            <w:proofErr w:type="spellEnd"/>
-            <w:proofErr w:type="gramEnd"/>
-            <w:r>
-              <w:rPr>
+            <w:r>
+              <w:rPr>
+                <w:color w:val="00B050"/>
+                <w:sz w:val="22"/>
+                <w:szCs w:val="22"/>
+                <w:lang w:val="en-US"/>
+              </w:rPr>
+              <w:t xml:space="preserve"> </w:t>
+            </w:r>
+            <w:r>
+              <w:rPr>
+                <w:color w:val="000000" w:themeColor="text1"/>
+                <w:sz w:val="22"/>
+                <w:szCs w:val="22"/>
+                <w:lang w:val="en-US"/>
+              </w:rPr>
+              <w:t>(d</w:t>
+            </w:r>
+            <w:r>
+              <w:rPr>
+                <w:color w:val="000000" w:themeColor="text1"/>
+                <w:sz w:val="22"/>
+                <w:szCs w:val="22"/>
+                <w:lang w:val="en-US"/>
+              </w:rPr>
+              <w:t>ec</w:t>
+            </w:r>
+            <w:r>
+              <w:rPr>
+                <w:color w:val="000000" w:themeColor="text1"/>
                 <w:sz w:val="22"/>
                 <w:szCs w:val="22"/>
                 <w:lang w:val="en-US"/>
@@ -3597,9 +3867,6 @@
         <w:tc>
           <w:tcPr>
             <w:tcW w:w="2268" w:type="dxa"/>
-            <w:tcBorders>
-              <w:bottom w:val="single" w:sz="4" w:space="0" w:color="auto"/>
-            </w:tcBorders>
           </w:tcPr>
           <w:p>
             <w:pPr>
@@ -3622,25 +3889,22 @@
         <w:tc>
           <w:tcPr>
             <w:tcW w:w="5358" w:type="dxa"/>
-            <w:tcBorders>
-              <w:bottom w:val="single" w:sz="4" w:space="0" w:color="auto"/>
-            </w:tcBorders>
-          </w:tcPr>
-          <w:p>
-            <w:pPr>
-              <w:rPr>
-                <w:sz w:val="22"/>
-                <w:szCs w:val="22"/>
-                <w:lang w:val="en-US"/>
-              </w:rPr>
-            </w:pPr>
-            <w:r>
-              <w:rPr>
-                <w:sz w:val="22"/>
-                <w:szCs w:val="22"/>
-                <w:lang w:val="en-US"/>
-              </w:rPr>
-              <w:t>Set output value of the pin (x – output number, y = 0 – off, 1 – on)</w:t>
+          </w:tcPr>
+          <w:p>
+            <w:pPr>
+              <w:rPr>
+                <w:sz w:val="22"/>
+                <w:szCs w:val="22"/>
+                <w:lang w:val="en-US"/>
+              </w:rPr>
+            </w:pPr>
+            <w:r>
+              <w:rPr>
+                <w:sz w:val="22"/>
+                <w:szCs w:val="22"/>
+                <w:lang w:val="en-US"/>
+              </w:rPr>
+              <w:t>Set raw value for DAC output (used in current limiter)</w:t>
             </w:r>
           </w:p>
         </w:tc>
@@ -3665,13 +3929,14 @@
               </w:rPr>
             </w:pPr>
             <w:proofErr w:type="spellStart"/>
-            <w:r>
-              <w:rPr>
-                <w:sz w:val="22"/>
-                <w:szCs w:val="22"/>
-                <w:lang w:val="en-US"/>
-              </w:rPr>
-              <w:t>PSW</w:t>
+            <w:proofErr w:type="gramStart"/>
+            <w:r>
+              <w:rPr>
+                <w:sz w:val="22"/>
+                <w:szCs w:val="22"/>
+                <w:lang w:val="en-US"/>
+              </w:rPr>
+              <w:t>OUT</w:t>
             </w:r>
             <w:r>
               <w:rPr>
@@ -3680,34 +3945,30 @@
                 <w:szCs w:val="22"/>
                 <w:lang w:val="en-US"/>
               </w:rPr>
-              <w:t>x</w:t>
+              <w:t>x:y</w:t>
             </w:r>
             <w:proofErr w:type="spellEnd"/>
-            <w:r>
-              <w:rPr>
-                <w:color w:val="00B050"/>
-                <w:sz w:val="22"/>
-                <w:szCs w:val="22"/>
-                <w:lang w:val="en-US"/>
-              </w:rPr>
-              <w:t xml:space="preserve"> </w:t>
-            </w:r>
-            <w:r>
-              <w:rPr>
-                <w:sz w:val="22"/>
-                <w:szCs w:val="22"/>
-                <w:lang w:val="en-US"/>
-              </w:rPr>
-              <w:t>(d</w:t>
-            </w:r>
-            <w:r>
-              <w:rPr>
-                <w:sz w:val="22"/>
-                <w:szCs w:val="22"/>
-                <w:lang w:val="en-US"/>
-              </w:rPr>
-              <w:t>ec</w:t>
-            </w:r>
+            <w:proofErr w:type="gramEnd"/>
+            <w:r>
+              <w:rPr>
+                <w:sz w:val="22"/>
+                <w:szCs w:val="22"/>
+                <w:lang w:val="en-US"/>
+              </w:rPr>
+              <w:t xml:space="preserve"> (</w:t>
+            </w:r>
+            <w:proofErr w:type="spellStart"/>
+            <w:proofErr w:type="gramStart"/>
+            <w:r>
+              <w:rPr>
+                <w:sz w:val="22"/>
+                <w:szCs w:val="22"/>
+                <w:lang w:val="en-US"/>
+              </w:rPr>
+              <w:t>dec:dec</w:t>
+            </w:r>
+            <w:proofErr w:type="spellEnd"/>
+            <w:proofErr w:type="gramEnd"/>
             <w:r>
               <w:rPr>
                 <w:sz w:val="22"/>
@@ -3764,7 +4025,7 @@
                 <w:szCs w:val="22"/>
                 <w:lang w:val="en-US"/>
               </w:rPr>
-              <w:t>Enter password for hidden commands</w:t>
+              <w:t>Set output value of the pin (x – output number, y = 0 – off, 1 – on)</w:t>
             </w:r>
           </w:p>
         </w:tc>
@@ -3775,30 +4036,120 @@
         </w:trPr>
         <w:tc>
           <w:tcPr>
-            <w:tcW w:w="10065" w:type="dxa"/>
-            <w:gridSpan w:val="3"/>
-            <w:shd w:val="clear" w:color="auto" w:fill="D9D9D9" w:themeFill="background1" w:themeFillShade="D9"/>
-          </w:tcPr>
-          <w:p>
-            <w:pPr>
-              <w:jc w:val="center"/>
-              <w:rPr>
-                <w:b/>
-                <w:bCs/>
-                <w:sz w:val="22"/>
-                <w:szCs w:val="22"/>
-                <w:lang w:val="en-US"/>
-              </w:rPr>
-            </w:pPr>
-            <w:r>
-              <w:rPr>
-                <w:b/>
-                <w:bCs/>
-                <w:sz w:val="22"/>
-                <w:szCs w:val="22"/>
-                <w:lang w:val="en-US"/>
-              </w:rPr>
-              <w:t>Bootloader commands</w:t>
+            <w:tcW w:w="2439" w:type="dxa"/>
+            <w:tcBorders>
+              <w:bottom w:val="single" w:sz="4" w:space="0" w:color="auto"/>
+            </w:tcBorders>
+          </w:tcPr>
+          <w:p>
+            <w:pPr>
+              <w:rPr>
+                <w:sz w:val="22"/>
+                <w:szCs w:val="22"/>
+                <w:lang w:val="en-US"/>
+              </w:rPr>
+            </w:pPr>
+            <w:proofErr w:type="spellStart"/>
+            <w:r>
+              <w:rPr>
+                <w:sz w:val="22"/>
+                <w:szCs w:val="22"/>
+                <w:lang w:val="en-US"/>
+              </w:rPr>
+              <w:t>PSW</w:t>
+            </w:r>
+            <w:r>
+              <w:rPr>
+                <w:color w:val="00B050"/>
+                <w:sz w:val="22"/>
+                <w:szCs w:val="22"/>
+                <w:lang w:val="en-US"/>
+              </w:rPr>
+              <w:t>x</w:t>
+            </w:r>
+            <w:proofErr w:type="spellEnd"/>
+            <w:r>
+              <w:rPr>
+                <w:color w:val="00B050"/>
+                <w:sz w:val="22"/>
+                <w:szCs w:val="22"/>
+                <w:lang w:val="en-US"/>
+              </w:rPr>
+              <w:t xml:space="preserve"> </w:t>
+            </w:r>
+            <w:r>
+              <w:rPr>
+                <w:sz w:val="22"/>
+                <w:szCs w:val="22"/>
+                <w:lang w:val="en-US"/>
+              </w:rPr>
+              <w:t>(d</w:t>
+            </w:r>
+            <w:r>
+              <w:rPr>
+                <w:sz w:val="22"/>
+                <w:szCs w:val="22"/>
+                <w:lang w:val="en-US"/>
+              </w:rPr>
+              <w:t>ec</w:t>
+            </w:r>
+            <w:r>
+              <w:rPr>
+                <w:sz w:val="22"/>
+                <w:szCs w:val="22"/>
+                <w:lang w:val="en-US"/>
+              </w:rPr>
+              <w:t>)</w:t>
+            </w:r>
+          </w:p>
+        </w:tc>
+        <w:tc>
+          <w:tcPr>
+            <w:tcW w:w="2268" w:type="dxa"/>
+            <w:tcBorders>
+              <w:bottom w:val="single" w:sz="4" w:space="0" w:color="auto"/>
+            </w:tcBorders>
+          </w:tcPr>
+          <w:p>
+            <w:pPr>
+              <w:rPr>
+                <w:sz w:val="22"/>
+                <w:szCs w:val="22"/>
+                <w:lang w:val="en-US"/>
+              </w:rPr>
+            </w:pPr>
+            <w:r>
+              <w:rPr>
+                <w:sz w:val="22"/>
+                <w:szCs w:val="22"/>
+                <w:lang w:val="en-US"/>
+              </w:rPr>
+              <w:t>OK</w:t>
+            </w:r>
+          </w:p>
+        </w:tc>
+        <w:tc>
+          <w:tcPr>
+            <w:tcW w:w="5358" w:type="dxa"/>
+            <w:tcBorders>
+              <w:bottom w:val="single" w:sz="4" w:space="0" w:color="auto"/>
+            </w:tcBorders>
+          </w:tcPr>
+          <w:p>
+            <w:pPr>
+              <w:rPr>
+                <w:sz w:val="22"/>
+                <w:szCs w:val="22"/>
+                <w:lang w:val="en-US"/>
+              </w:rPr>
+            </w:pPr>
+            <w:r>
+              <w:rPr>
+                <w:sz w:val="22"/>
+                <w:szCs w:val="22"/>
+                <w:lang w:val="en-US"/>
+              </w:rPr>
+              <w:t>Enter password for hidden commands</w:t>
             </w:r>
           </w:p>
         </w:tc>
@@ -3809,67 +4160,31 @@
         </w:trPr>
         <w:tc>
           <w:tcPr>
-            <w:tcW w:w="2439" w:type="dxa"/>
-          </w:tcPr>
-          <w:p>
-            <w:pPr>
-              <w:rPr>
-                <w:sz w:val="22"/>
-                <w:szCs w:val="22"/>
-                <w:lang w:val="en-US"/>
-              </w:rPr>
-            </w:pPr>
-            <w:r>
-              <w:rPr>
-                <w:sz w:val="22"/>
-                <w:szCs w:val="22"/>
-                <w:lang w:val="en-US"/>
-              </w:rPr>
-              <w:t>BLS</w:t>
-            </w:r>
-          </w:p>
-        </w:tc>
-        <w:tc>
-          <w:tcPr>
-            <w:tcW w:w="2268" w:type="dxa"/>
-          </w:tcPr>
-          <w:p>
-            <w:pPr>
-              <w:rPr>
-                <w:sz w:val="22"/>
-                <w:szCs w:val="22"/>
-                <w:lang w:val="en-US"/>
-              </w:rPr>
-            </w:pPr>
-            <w:r>
-              <w:rPr>
-                <w:sz w:val="22"/>
-                <w:szCs w:val="22"/>
-                <w:lang w:val="en-US"/>
-              </w:rPr>
-              <w:t>OK</w:t>
-            </w:r>
-          </w:p>
-        </w:tc>
-        <w:tc>
-          <w:tcPr>
-            <w:tcW w:w="5358" w:type="dxa"/>
-          </w:tcPr>
-          <w:p>
-            <w:pPr>
-              <w:rPr>
-                <w:sz w:val="22"/>
-                <w:szCs w:val="22"/>
-                <w:lang w:val="en-US"/>
-              </w:rPr>
-            </w:pPr>
-            <w:r>
-              <w:rPr>
-                <w:sz w:val="22"/>
-                <w:szCs w:val="22"/>
-                <w:lang w:val="en-US"/>
-              </w:rPr>
-              <w:t>Start servo firmware bootloader</w:t>
+            <w:tcW w:w="10065" w:type="dxa"/>
+            <w:gridSpan w:val="3"/>
+            <w:shd w:val="clear" w:color="auto" w:fill="D9D9D9" w:themeFill="background1" w:themeFillShade="D9"/>
+          </w:tcPr>
+          <w:p>
+            <w:pPr>
+              <w:jc w:val="center"/>
+              <w:rPr>
+                <w:b/>
+                <w:bCs/>
+                <w:sz w:val="22"/>
+                <w:szCs w:val="22"/>
+                <w:lang w:val="en-US"/>
+              </w:rPr>
+            </w:pPr>
+            <w:r>
+              <w:rPr>
+                <w:b/>
+                <w:bCs/>
+                <w:sz w:val="22"/>
+                <w:szCs w:val="22"/>
+                <w:lang w:val="en-US"/>
+              </w:rPr>
+              <w:lastRenderedPageBreak/>
+              <w:t>Bootloader commands</w:t>
             </w:r>
           </w:p>
         </w:tc>
@@ -3896,7 +4211,7 @@
                 <w:szCs w:val="22"/>
                 <w:lang w:val="en-US"/>
               </w:rPr>
-              <w:t>BLQ</w:t>
+              <w:t>BLS</w:t>
             </w:r>
           </w:p>
         </w:tc>
@@ -3940,7 +4255,7 @@
                 <w:szCs w:val="22"/>
                 <w:lang w:val="en-US"/>
               </w:rPr>
-              <w:t>Quit servo bootloader</w:t>
+              <w:t>Start servo firmware bootloader</w:t>
             </w:r>
           </w:p>
         </w:tc>
@@ -3967,24 +4282,7 @@
                 <w:szCs w:val="22"/>
                 <w:lang w:val="en-US"/>
               </w:rPr>
-              <w:t>BLP</w:t>
-            </w:r>
-            <w:r>
-              <w:rPr>
-                <w:color w:val="00B050"/>
-                <w:sz w:val="22"/>
-                <w:szCs w:val="22"/>
-                <w:lang w:val="en-US"/>
-              </w:rPr>
-              <w:t>x</w:t>
-            </w:r>
-            <w:r>
-              <w:rPr>
-                <w:sz w:val="22"/>
-                <w:szCs w:val="22"/>
-                <w:lang w:val="en-US"/>
-              </w:rPr>
-              <w:t xml:space="preserve"> (dec)</w:t>
+              <w:t>BLQ</w:t>
             </w:r>
           </w:p>
         </w:tc>
@@ -4028,31 +4326,7 @@
                 <w:szCs w:val="22"/>
                 <w:lang w:val="en-US"/>
               </w:rPr>
-              <w:t>S</w:t>
-            </w:r>
-            <w:r>
-              <w:rPr>
-                <w:sz w:val="22"/>
-                <w:szCs w:val="22"/>
-                <w:lang w:val="en-US"/>
-              </w:rPr>
-              <w:t xml:space="preserve">et PCB ID </w:t>
-            </w:r>
-            <w:r>
-              <w:rPr>
-                <w:sz w:val="22"/>
-                <w:szCs w:val="22"/>
-                <w:lang w:val="en-US"/>
-              </w:rPr>
-              <w:t xml:space="preserve">for update </w:t>
-            </w:r>
-            <w:r>
-              <w:rPr>
-                <w:sz w:val="22"/>
-                <w:szCs w:val="22"/>
-                <w:lang w:val="en-US"/>
-              </w:rPr>
-              <w:t>(duplex only)</w:t>
+              <w:t>Quit servo bootloader</w:t>
             </w:r>
           </w:p>
         </w:tc>
@@ -4073,6 +4347,118 @@
                 <w:lang w:val="en-US"/>
               </w:rPr>
             </w:pPr>
+            <w:r>
+              <w:rPr>
+                <w:sz w:val="22"/>
+                <w:szCs w:val="22"/>
+                <w:lang w:val="en-US"/>
+              </w:rPr>
+              <w:t>BLP</w:t>
+            </w:r>
+            <w:r>
+              <w:rPr>
+                <w:color w:val="00B050"/>
+                <w:sz w:val="22"/>
+                <w:szCs w:val="22"/>
+                <w:lang w:val="en-US"/>
+              </w:rPr>
+              <w:t>x</w:t>
+            </w:r>
+            <w:r>
+              <w:rPr>
+                <w:sz w:val="22"/>
+                <w:szCs w:val="22"/>
+                <w:lang w:val="en-US"/>
+              </w:rPr>
+              <w:t xml:space="preserve"> (dec)</w:t>
+            </w:r>
+          </w:p>
+        </w:tc>
+        <w:tc>
+          <w:tcPr>
+            <w:tcW w:w="2268" w:type="dxa"/>
+          </w:tcPr>
+          <w:p>
+            <w:pPr>
+              <w:rPr>
+                <w:sz w:val="22"/>
+                <w:szCs w:val="22"/>
+                <w:lang w:val="en-US"/>
+              </w:rPr>
+            </w:pPr>
+            <w:r>
+              <w:rPr>
+                <w:sz w:val="22"/>
+                <w:szCs w:val="22"/>
+                <w:lang w:val="en-US"/>
+              </w:rPr>
+              <w:t>OK</w:t>
+            </w:r>
+          </w:p>
+        </w:tc>
+        <w:tc>
+          <w:tcPr>
+            <w:tcW w:w="5358" w:type="dxa"/>
+          </w:tcPr>
+          <w:p>
+            <w:pPr>
+              <w:rPr>
+                <w:sz w:val="22"/>
+                <w:szCs w:val="22"/>
+                <w:lang w:val="en-US"/>
+              </w:rPr>
+            </w:pPr>
+            <w:r>
+              <w:rPr>
+                <w:sz w:val="22"/>
+                <w:szCs w:val="22"/>
+                <w:lang w:val="en-US"/>
+              </w:rPr>
+              <w:t>S</w:t>
+            </w:r>
+            <w:r>
+              <w:rPr>
+                <w:sz w:val="22"/>
+                <w:szCs w:val="22"/>
+                <w:lang w:val="en-US"/>
+              </w:rPr>
+              <w:t xml:space="preserve">et PCB ID </w:t>
+            </w:r>
+            <w:r>
+              <w:rPr>
+                <w:sz w:val="22"/>
+                <w:szCs w:val="22"/>
+                <w:lang w:val="en-US"/>
+              </w:rPr>
+              <w:t xml:space="preserve">for update </w:t>
+            </w:r>
+            <w:r>
+              <w:rPr>
+                <w:sz w:val="22"/>
+                <w:szCs w:val="22"/>
+                <w:lang w:val="en-US"/>
+              </w:rPr>
+              <w:t>(duplex only)</w:t>
+            </w:r>
+          </w:p>
+        </w:tc>
+      </w:tr>
+      <w:tr>
+        <w:trPr>
+          <w:trHeight w:val="240"/>
+        </w:trPr>
+        <w:tc>
+          <w:tcPr>
+            <w:tcW w:w="2439" w:type="dxa"/>
+          </w:tcPr>
+          <w:p>
+            <w:pPr>
+              <w:rPr>
+                <w:sz w:val="22"/>
+                <w:szCs w:val="22"/>
+                <w:lang w:val="en-US"/>
+              </w:rPr>
+            </w:pPr>
             <w:proofErr w:type="spellStart"/>
             <w:r>
               <w:rPr>
@@ -4080,7 +4466,6 @@
                 <w:szCs w:val="22"/>
                 <w:lang w:val="en-US"/>
               </w:rPr>
-              <w:lastRenderedPageBreak/>
               <w:t>BLF</w:t>
             </w:r>
             <w:r>

</xml_diff>

<commit_message>
Flashing VPT firmware added
</commit_message>
<xml_diff>
--- a/doc/CommandSet_Multiservo.docx
+++ b/doc/CommandSet_Multiservo.docx
@@ -160,7 +160,7 @@
         <w:rPr>
           <w:b/>
           <w:bCs/>
-          <w:lang w:val="ru-RU"/>
+          <w:lang w:val="en-US"/>
         </w:rPr>
       </w:pPr>
       <w:r>
@@ -183,7 +183,7 @@
         <w:rPr>
           <w:b/>
           <w:bCs/>
-          <w:lang w:val="ru-RU"/>
+          <w:lang w:val="en-US"/>
         </w:rPr>
         <w:t>4</w:t>
       </w:r>
@@ -1909,9 +1909,6 @@
         </w:tc>
       </w:tr>
       <w:tr>
-        <w:trPr>
-          <w:trHeight w:val="240"/>
-        </w:trPr>
         <w:tc>
           <w:tcPr>
             <w:tcW w:w="2439" w:type="dxa"/>
@@ -1924,6 +1921,7 @@
                 <w:lang w:val="en-US"/>
               </w:rPr>
             </w:pPr>
+            <w:proofErr w:type="spellStart"/>
             <w:r>
               <w:rPr>
                 <w:sz w:val="22"/>
@@ -1941,6 +1939,7 @@
               </w:rPr>
               <w:t>x</w:t>
             </w:r>
+            <w:proofErr w:type="spellEnd"/>
             <w:r>
               <w:rPr>
                 <w:sz w:val="22"/>
@@ -2089,6 +2088,7 @@
                 <w:lang w:val="en-US"/>
               </w:rPr>
             </w:pPr>
+            <w:proofErr w:type="spellStart"/>
             <w:r>
               <w:rPr>
                 <w:sz w:val="22"/>
@@ -2106,6 +2106,7 @@
               </w:rPr>
               <w:t>x</w:t>
             </w:r>
+            <w:proofErr w:type="spellEnd"/>
             <w:r>
               <w:rPr>
                 <w:color w:val="00B050"/>
@@ -2214,23 +2215,16 @@
                 <w:lang w:val="en-US"/>
               </w:rPr>
             </w:pPr>
-            <w:r>
-              <w:rPr>
-                <w:sz w:val="22"/>
-                <w:szCs w:val="22"/>
-                <w:lang w:val="en-US"/>
-              </w:rPr>
-              <w:t>SID</w:t>
-            </w:r>
-            <w:r>
-              <w:rPr>
-                <w:color w:val="00B050"/>
-                <w:sz w:val="22"/>
-                <w:szCs w:val="22"/>
-                <w:lang w:val="en-US"/>
-              </w:rPr>
-              <w:t>x</w:t>
-            </w:r>
+            <w:proofErr w:type="spellStart"/>
+            <w:r>
+              <w:rPr>
+                <w:sz w:val="22"/>
+                <w:szCs w:val="22"/>
+                <w:lang w:val="en-US"/>
+              </w:rPr>
+              <w:t>SSIx</w:t>
+            </w:r>
+            <w:proofErr w:type="spellEnd"/>
             <w:r>
               <w:rPr>
                 <w:sz w:val="22"/>
@@ -2287,39 +2281,7 @@
                 <w:szCs w:val="22"/>
                 <w:lang w:val="en-US"/>
               </w:rPr>
-              <w:t>S</w:t>
-            </w:r>
-            <w:r>
-              <w:rPr>
-                <w:sz w:val="22"/>
-                <w:szCs w:val="22"/>
-                <w:lang w:val="en-US"/>
-              </w:rPr>
-              <w:t xml:space="preserve">et </w:t>
-            </w:r>
-            <w:r>
-              <w:rPr>
-                <w:sz w:val="22"/>
-                <w:szCs w:val="22"/>
-                <w:lang w:val="en-US"/>
-              </w:rPr>
-              <w:t xml:space="preserve">servo </w:t>
-            </w:r>
-            <w:r>
-              <w:rPr>
-                <w:sz w:val="22"/>
-                <w:szCs w:val="22"/>
-                <w:lang w:val="en-US"/>
-              </w:rPr>
-              <w:t>ID for bus protocols</w:t>
-            </w:r>
-            <w:r>
-              <w:rPr>
-                <w:sz w:val="22"/>
-                <w:szCs w:val="22"/>
-                <w:lang w:val="en-US"/>
-              </w:rPr>
-              <w:t xml:space="preserve"> (RS485, CAN)</w:t>
+              <w:t>Set sub-interface (RS485)</w:t>
             </w:r>
           </w:p>
         </w:tc>
@@ -2350,7 +2312,7 @@
                 <w:szCs w:val="22"/>
                 <w:lang w:val="en-US"/>
               </w:rPr>
-              <w:t>SCL</w:t>
+              <w:t>SBI</w:t>
             </w:r>
             <w:r>
               <w:rPr>
@@ -2359,7 +2321,7 @@
                 <w:szCs w:val="22"/>
                 <w:lang w:val="en-US"/>
               </w:rPr>
-              <w:t>x</w:t>
+              <w:t>xxx</w:t>
             </w:r>
             <w:proofErr w:type="spellEnd"/>
             <w:r>
@@ -2368,7 +2330,7 @@
                 <w:szCs w:val="22"/>
                 <w:lang w:val="en-US"/>
               </w:rPr>
-              <w:t xml:space="preserve"> (dec)</w:t>
+              <w:t xml:space="preserve"> (hex)</w:t>
             </w:r>
           </w:p>
         </w:tc>
@@ -2418,7 +2380,7 @@
                 <w:szCs w:val="22"/>
                 <w:lang w:val="en-US"/>
               </w:rPr>
-              <w:t>Set current limitation, A</w:t>
+              <w:t>Set base CAN ID (CAN)</w:t>
             </w:r>
           </w:p>
         </w:tc>
@@ -2429,30 +2391,127 @@
         </w:trPr>
         <w:tc>
           <w:tcPr>
-            <w:tcW w:w="10065" w:type="dxa"/>
-            <w:gridSpan w:val="3"/>
-            <w:shd w:val="clear" w:color="auto" w:fill="D9D9D9" w:themeFill="background1" w:themeFillShade="D9"/>
-          </w:tcPr>
-          <w:p>
-            <w:pPr>
-              <w:jc w:val="center"/>
-              <w:rPr>
-                <w:b/>
-                <w:bCs/>
-                <w:sz w:val="22"/>
-                <w:szCs w:val="22"/>
-                <w:lang w:val="en-US"/>
-              </w:rPr>
-            </w:pPr>
-            <w:r>
-              <w:rPr>
-                <w:b/>
-                <w:bCs/>
-                <w:sz w:val="22"/>
-                <w:szCs w:val="22"/>
-                <w:lang w:val="en-US"/>
-              </w:rPr>
-              <w:t>Action commands (Do something)</w:t>
+            <w:tcW w:w="2439" w:type="dxa"/>
+            <w:tcBorders>
+              <w:bottom w:val="single" w:sz="4" w:space="0" w:color="auto"/>
+            </w:tcBorders>
+          </w:tcPr>
+          <w:p>
+            <w:pPr>
+              <w:rPr>
+                <w:sz w:val="22"/>
+                <w:szCs w:val="22"/>
+                <w:lang w:val="en-US"/>
+              </w:rPr>
+            </w:pPr>
+            <w:proofErr w:type="spellStart"/>
+            <w:r>
+              <w:rPr>
+                <w:sz w:val="22"/>
+                <w:szCs w:val="22"/>
+                <w:lang w:val="en-US"/>
+              </w:rPr>
+              <w:t>SID</w:t>
+            </w:r>
+            <w:r>
+              <w:rPr>
+                <w:color w:val="00B050"/>
+                <w:sz w:val="22"/>
+                <w:szCs w:val="22"/>
+                <w:lang w:val="en-US"/>
+              </w:rPr>
+              <w:t>x</w:t>
+            </w:r>
+            <w:proofErr w:type="spellEnd"/>
+            <w:r>
+              <w:rPr>
+                <w:sz w:val="22"/>
+                <w:szCs w:val="22"/>
+                <w:lang w:val="en-US"/>
+              </w:rPr>
+              <w:t xml:space="preserve"> (dec)</w:t>
+            </w:r>
+          </w:p>
+        </w:tc>
+        <w:tc>
+          <w:tcPr>
+            <w:tcW w:w="2268" w:type="dxa"/>
+            <w:tcBorders>
+              <w:bottom w:val="single" w:sz="4" w:space="0" w:color="auto"/>
+            </w:tcBorders>
+          </w:tcPr>
+          <w:p>
+            <w:pPr>
+              <w:rPr>
+                <w:sz w:val="22"/>
+                <w:szCs w:val="22"/>
+                <w:lang w:val="en-US"/>
+              </w:rPr>
+            </w:pPr>
+            <w:r>
+              <w:rPr>
+                <w:sz w:val="22"/>
+                <w:szCs w:val="22"/>
+                <w:lang w:val="en-US"/>
+              </w:rPr>
+              <w:t>OK</w:t>
+            </w:r>
+          </w:p>
+        </w:tc>
+        <w:tc>
+          <w:tcPr>
+            <w:tcW w:w="5358" w:type="dxa"/>
+            <w:tcBorders>
+              <w:bottom w:val="single" w:sz="4" w:space="0" w:color="auto"/>
+            </w:tcBorders>
+          </w:tcPr>
+          <w:p>
+            <w:pPr>
+              <w:rPr>
+                <w:sz w:val="22"/>
+                <w:szCs w:val="22"/>
+                <w:lang w:val="en-US"/>
+              </w:rPr>
+            </w:pPr>
+            <w:r>
+              <w:rPr>
+                <w:sz w:val="22"/>
+                <w:szCs w:val="22"/>
+                <w:lang w:val="en-US"/>
+              </w:rPr>
+              <w:t>S</w:t>
+            </w:r>
+            <w:r>
+              <w:rPr>
+                <w:sz w:val="22"/>
+                <w:szCs w:val="22"/>
+                <w:lang w:val="en-US"/>
+              </w:rPr>
+              <w:t xml:space="preserve">et </w:t>
+            </w:r>
+            <w:r>
+              <w:rPr>
+                <w:sz w:val="22"/>
+                <w:szCs w:val="22"/>
+                <w:lang w:val="en-US"/>
+              </w:rPr>
+              <w:t xml:space="preserve">servo </w:t>
+            </w:r>
+            <w:r>
+              <w:rPr>
+                <w:sz w:val="22"/>
+                <w:szCs w:val="22"/>
+                <w:lang w:val="en-US"/>
+              </w:rPr>
+              <w:t>ID for bus protocols</w:t>
+            </w:r>
+            <w:r>
+              <w:rPr>
+                <w:sz w:val="22"/>
+                <w:szCs w:val="22"/>
+                <w:lang w:val="en-US"/>
+              </w:rPr>
+              <w:t xml:space="preserve"> (RS485, CAN)</w:t>
             </w:r>
           </w:p>
         </w:tc>
@@ -2464,6 +2523,9 @@
         <w:tc>
           <w:tcPr>
             <w:tcW w:w="2439" w:type="dxa"/>
+            <w:tcBorders>
+              <w:bottom w:val="single" w:sz="4" w:space="0" w:color="auto"/>
+            </w:tcBorders>
           </w:tcPr>
           <w:p>
             <w:pPr>
@@ -2480,6 +2542,136 @@
                 <w:szCs w:val="22"/>
                 <w:lang w:val="en-US"/>
               </w:rPr>
+              <w:t>SCL</w:t>
+            </w:r>
+            <w:r>
+              <w:rPr>
+                <w:color w:val="00B050"/>
+                <w:sz w:val="22"/>
+                <w:szCs w:val="22"/>
+                <w:lang w:val="en-US"/>
+              </w:rPr>
+              <w:t>x</w:t>
+            </w:r>
+            <w:proofErr w:type="spellEnd"/>
+            <w:r>
+              <w:rPr>
+                <w:sz w:val="22"/>
+                <w:szCs w:val="22"/>
+                <w:lang w:val="en-US"/>
+              </w:rPr>
+              <w:t xml:space="preserve"> (dec)</w:t>
+            </w:r>
+          </w:p>
+        </w:tc>
+        <w:tc>
+          <w:tcPr>
+            <w:tcW w:w="2268" w:type="dxa"/>
+            <w:tcBorders>
+              <w:bottom w:val="single" w:sz="4" w:space="0" w:color="auto"/>
+            </w:tcBorders>
+          </w:tcPr>
+          <w:p>
+            <w:pPr>
+              <w:rPr>
+                <w:sz w:val="22"/>
+                <w:szCs w:val="22"/>
+                <w:lang w:val="en-US"/>
+              </w:rPr>
+            </w:pPr>
+            <w:r>
+              <w:rPr>
+                <w:sz w:val="22"/>
+                <w:szCs w:val="22"/>
+                <w:lang w:val="en-US"/>
+              </w:rPr>
+              <w:t>OK</w:t>
+            </w:r>
+          </w:p>
+        </w:tc>
+        <w:tc>
+          <w:tcPr>
+            <w:tcW w:w="5358" w:type="dxa"/>
+            <w:tcBorders>
+              <w:bottom w:val="single" w:sz="4" w:space="0" w:color="auto"/>
+            </w:tcBorders>
+          </w:tcPr>
+          <w:p>
+            <w:pPr>
+              <w:rPr>
+                <w:sz w:val="22"/>
+                <w:szCs w:val="22"/>
+                <w:lang w:val="en-US"/>
+              </w:rPr>
+            </w:pPr>
+            <w:r>
+              <w:rPr>
+                <w:sz w:val="22"/>
+                <w:szCs w:val="22"/>
+                <w:lang w:val="en-US"/>
+              </w:rPr>
+              <w:t>Set current limitation, A</w:t>
+            </w:r>
+          </w:p>
+        </w:tc>
+      </w:tr>
+      <w:tr>
+        <w:trPr>
+          <w:trHeight w:val="240"/>
+        </w:trPr>
+        <w:tc>
+          <w:tcPr>
+            <w:tcW w:w="10065" w:type="dxa"/>
+            <w:gridSpan w:val="3"/>
+            <w:shd w:val="clear" w:color="auto" w:fill="D9D9D9" w:themeFill="background1" w:themeFillShade="D9"/>
+          </w:tcPr>
+          <w:p>
+            <w:pPr>
+              <w:jc w:val="center"/>
+              <w:rPr>
+                <w:b/>
+                <w:bCs/>
+                <w:sz w:val="22"/>
+                <w:szCs w:val="22"/>
+                <w:lang w:val="en-US"/>
+              </w:rPr>
+            </w:pPr>
+            <w:r>
+              <w:rPr>
+                <w:b/>
+                <w:bCs/>
+                <w:sz w:val="22"/>
+                <w:szCs w:val="22"/>
+                <w:lang w:val="en-US"/>
+              </w:rPr>
+              <w:t>Action commands (Do something)</w:t>
+            </w:r>
+          </w:p>
+        </w:tc>
+      </w:tr>
+      <w:tr>
+        <w:trPr>
+          <w:trHeight w:val="240"/>
+        </w:trPr>
+        <w:tc>
+          <w:tcPr>
+            <w:tcW w:w="2439" w:type="dxa"/>
+          </w:tcPr>
+          <w:p>
+            <w:pPr>
+              <w:rPr>
+                <w:sz w:val="22"/>
+                <w:szCs w:val="22"/>
+                <w:lang w:val="en-US"/>
+              </w:rPr>
+            </w:pPr>
+            <w:proofErr w:type="spellStart"/>
+            <w:r>
+              <w:rPr>
+                <w:sz w:val="22"/>
+                <w:szCs w:val="22"/>
+                <w:lang w:val="en-US"/>
+              </w:rPr>
               <w:t>DP</w:t>
             </w:r>
             <w:r>
@@ -2588,6 +2780,85 @@
                 <w:lang w:val="en-US"/>
               </w:rPr>
               <w:t>degrees</w:t>
+            </w:r>
+          </w:p>
+        </w:tc>
+      </w:tr>
+      <w:tr>
+        <w:trPr>
+          <w:trHeight w:val="240"/>
+        </w:trPr>
+        <w:tc>
+          <w:tcPr>
+            <w:tcW w:w="2439" w:type="dxa"/>
+          </w:tcPr>
+          <w:p>
+            <w:pPr>
+              <w:rPr>
+                <w:sz w:val="22"/>
+                <w:szCs w:val="22"/>
+                <w:lang w:val="en-US"/>
+              </w:rPr>
+            </w:pPr>
+            <w:r>
+              <w:rPr>
+                <w:sz w:val="22"/>
+                <w:szCs w:val="22"/>
+                <w:lang w:val="en-US"/>
+              </w:rPr>
+              <w:t>DZP</w:t>
+            </w:r>
+          </w:p>
+        </w:tc>
+        <w:tc>
+          <w:tcPr>
+            <w:tcW w:w="2268" w:type="dxa"/>
+          </w:tcPr>
+          <w:p>
+            <w:pPr>
+              <w:rPr>
+                <w:sz w:val="22"/>
+                <w:szCs w:val="22"/>
+                <w:lang w:val="en-US"/>
+              </w:rPr>
+            </w:pPr>
+            <w:r>
+              <w:rPr>
+                <w:sz w:val="22"/>
+                <w:szCs w:val="22"/>
+                <w:lang w:val="en-US"/>
+              </w:rPr>
+              <w:t>OK</w:t>
+            </w:r>
+          </w:p>
+        </w:tc>
+        <w:tc>
+          <w:tcPr>
+            <w:tcW w:w="5358" w:type="dxa"/>
+          </w:tcPr>
+          <w:p>
+            <w:pPr>
+              <w:rPr>
+                <w:sz w:val="22"/>
+                <w:szCs w:val="22"/>
+                <w:lang w:val="en-US"/>
+              </w:rPr>
+            </w:pPr>
+            <w:r>
+              <w:rPr>
+                <w:sz w:val="22"/>
+                <w:szCs w:val="22"/>
+                <w:lang w:val="en-US"/>
+              </w:rPr>
+              <w:t>Set actual position as zero point</w:t>
+            </w:r>
+            <w:r>
+              <w:rPr>
+                <w:sz w:val="22"/>
+                <w:szCs w:val="22"/>
+                <w:lang w:val="en-US"/>
+              </w:rPr>
+              <w:t xml:space="preserve"> ()</w:t>
             </w:r>
           </w:p>
         </w:tc>
@@ -3936,6 +4207,7 @@
                 <w:szCs w:val="22"/>
                 <w:lang w:val="en-US"/>
               </w:rPr>
+              <w:lastRenderedPageBreak/>
               <w:t>OUT</w:t>
             </w:r>
             <w:r>
@@ -4183,7 +4455,6 @@
                 <w:szCs w:val="22"/>
                 <w:lang w:val="en-US"/>
               </w:rPr>
-              <w:lastRenderedPageBreak/>
               <w:t>Bootloader commands</w:t>
             </w:r>
           </w:p>
@@ -5192,13 +5463,13 @@
         <w:tblLook w:val="04A0" w:firstRow="1" w:lastRow="0" w:firstColumn="1" w:lastColumn="0" w:noHBand="0" w:noVBand="1"/>
       </w:tblPr>
       <w:tblGrid>
-        <w:gridCol w:w="1838"/>
-        <w:gridCol w:w="7216"/>
+        <w:gridCol w:w="1980"/>
+        <w:gridCol w:w="7074"/>
       </w:tblGrid>
       <w:tr>
         <w:tc>
           <w:tcPr>
-            <w:tcW w:w="1838" w:type="dxa"/>
+            <w:tcW w:w="1980" w:type="dxa"/>
             <w:shd w:val="clear" w:color="auto" w:fill="D9D9D9" w:themeFill="background1" w:themeFillShade="D9"/>
           </w:tcPr>
           <w:p>
@@ -5220,7 +5491,7 @@
         </w:tc>
         <w:tc>
           <w:tcPr>
-            <w:tcW w:w="7216" w:type="dxa"/>
+            <w:tcW w:w="7074" w:type="dxa"/>
             <w:shd w:val="clear" w:color="auto" w:fill="D9D9D9" w:themeFill="background1" w:themeFillShade="D9"/>
           </w:tcPr>
           <w:p>
@@ -5244,7 +5515,7 @@
       <w:tr>
         <w:tc>
           <w:tcPr>
-            <w:tcW w:w="1838" w:type="dxa"/>
+            <w:tcW w:w="1980" w:type="dxa"/>
           </w:tcPr>
           <w:p>
             <w:pPr>
@@ -5265,7 +5536,7 @@
         </w:tc>
         <w:tc>
           <w:tcPr>
-            <w:tcW w:w="7216" w:type="dxa"/>
+            <w:tcW w:w="7074" w:type="dxa"/>
           </w:tcPr>
           <w:p>
             <w:pPr>
@@ -5287,7 +5558,7 @@
       <w:tr>
         <w:tc>
           <w:tcPr>
-            <w:tcW w:w="1838" w:type="dxa"/>
+            <w:tcW w:w="1980" w:type="dxa"/>
           </w:tcPr>
           <w:p>
             <w:pPr>
@@ -5308,7 +5579,7 @@
         </w:tc>
         <w:tc>
           <w:tcPr>
-            <w:tcW w:w="7216" w:type="dxa"/>
+            <w:tcW w:w="7074" w:type="dxa"/>
           </w:tcPr>
           <w:p>
             <w:pPr>
@@ -5339,7 +5610,440 @@
           <w:szCs w:val="28"/>
         </w:rPr>
       </w:pPr>
+      <w:r>
+        <w:rPr>
+          <w:b/>
+          <w:sz w:val="28"/>
+          <w:szCs w:val="28"/>
+        </w:rPr>
+        <w:t xml:space="preserve">Interface Type (SI </w:t>
+      </w:r>
+      <w:proofErr w:type="spellStart"/>
+      <w:r>
+        <w:rPr>
+          <w:b/>
+          <w:sz w:val="28"/>
+          <w:szCs w:val="28"/>
+        </w:rPr>
+        <w:t>command</w:t>
+      </w:r>
+      <w:proofErr w:type="spellEnd"/>
+      <w:r>
+        <w:rPr>
+          <w:b/>
+          <w:sz w:val="28"/>
+          <w:szCs w:val="28"/>
+        </w:rPr>
+        <w:t>)</w:t>
+      </w:r>
     </w:p>
+    <w:tbl>
+      <w:tblPr>
+        <w:tblStyle w:val="Tabellenraster"/>
+        <w:tblW w:w="0" w:type="auto"/>
+        <w:tblLook w:val="04A0" w:firstRow="1" w:lastRow="0" w:firstColumn="1" w:lastColumn="0" w:noHBand="0" w:noVBand="1"/>
+      </w:tblPr>
+      <w:tblGrid>
+        <w:gridCol w:w="1980"/>
+        <w:gridCol w:w="7074"/>
+      </w:tblGrid>
+      <w:tr>
+        <w:tc>
+          <w:tcPr>
+            <w:tcW w:w="1980" w:type="dxa"/>
+            <w:shd w:val="clear" w:color="auto" w:fill="D9D9D9" w:themeFill="background1" w:themeFillShade="D9"/>
+          </w:tcPr>
+          <w:p>
+            <w:pPr>
+              <w:jc w:val="center"/>
+              <w:rPr>
+                <w:b/>
+              </w:rPr>
+            </w:pPr>
+            <w:r>
+              <w:rPr>
+                <w:b/>
+              </w:rPr>
+              <w:t>Inter</w:t>
+            </w:r>
+            <w:r>
+              <w:rPr>
+                <w:b/>
+              </w:rPr>
+              <w:t>f</w:t>
+            </w:r>
+            <w:r>
+              <w:rPr>
+                <w:b/>
+              </w:rPr>
+              <w:t>ace ID</w:t>
+            </w:r>
+          </w:p>
+        </w:tc>
+        <w:tc>
+          <w:tcPr>
+            <w:tcW w:w="7074" w:type="dxa"/>
+            <w:shd w:val="clear" w:color="auto" w:fill="D9D9D9" w:themeFill="background1" w:themeFillShade="D9"/>
+          </w:tcPr>
+          <w:p>
+            <w:pPr>
+              <w:jc w:val="center"/>
+              <w:rPr>
+                <w:b/>
+              </w:rPr>
+            </w:pPr>
+            <w:r>
+              <w:rPr>
+                <w:b/>
+              </w:rPr>
+              <w:t>Description</w:t>
+            </w:r>
+          </w:p>
+        </w:tc>
+      </w:tr>
+      <w:tr>
+        <w:tc>
+          <w:tcPr>
+            <w:tcW w:w="1980" w:type="dxa"/>
+          </w:tcPr>
+          <w:p>
+            <w:pPr>
+              <w:jc w:val="center"/>
+              <w:rPr>
+                <w:bCs/>
+              </w:rPr>
+            </w:pPr>
+            <w:r>
+              <w:rPr>
+                <w:bCs/>
+              </w:rPr>
+              <w:t>0</w:t>
+            </w:r>
+          </w:p>
+        </w:tc>
+        <w:tc>
+          <w:tcPr>
+            <w:tcW w:w="7074" w:type="dxa"/>
+          </w:tcPr>
+          <w:p>
+            <w:pPr>
+              <w:rPr>
+                <w:bCs/>
+              </w:rPr>
+            </w:pPr>
+            <w:r>
+              <w:rPr>
+                <w:bCs/>
+              </w:rPr>
+              <w:t>PWM</w:t>
+            </w:r>
+          </w:p>
+        </w:tc>
+      </w:tr>
+      <w:tr>
+        <w:tc>
+          <w:tcPr>
+            <w:tcW w:w="1980" w:type="dxa"/>
+          </w:tcPr>
+          <w:p>
+            <w:pPr>
+              <w:jc w:val="center"/>
+              <w:rPr>
+                <w:bCs/>
+              </w:rPr>
+            </w:pPr>
+            <w:r>
+              <w:rPr>
+                <w:bCs/>
+              </w:rPr>
+              <w:t>1</w:t>
+            </w:r>
+          </w:p>
+        </w:tc>
+        <w:tc>
+          <w:tcPr>
+            <w:tcW w:w="7074" w:type="dxa"/>
+          </w:tcPr>
+          <w:p>
+            <w:pPr>
+              <w:rPr>
+                <w:bCs/>
+              </w:rPr>
+            </w:pPr>
+            <w:r>
+              <w:rPr>
+                <w:bCs/>
+              </w:rPr>
+              <w:t>RS485</w:t>
+            </w:r>
+          </w:p>
+        </w:tc>
+      </w:tr>
+      <w:tr>
+        <w:tc>
+          <w:tcPr>
+            <w:tcW w:w="1980" w:type="dxa"/>
+          </w:tcPr>
+          <w:p>
+            <w:pPr>
+              <w:jc w:val="center"/>
+              <w:rPr>
+                <w:bCs/>
+              </w:rPr>
+            </w:pPr>
+            <w:r>
+              <w:rPr>
+                <w:bCs/>
+              </w:rPr>
+              <w:t>2</w:t>
+            </w:r>
+          </w:p>
+        </w:tc>
+        <w:tc>
+          <w:tcPr>
+            <w:tcW w:w="7074" w:type="dxa"/>
+          </w:tcPr>
+          <w:p>
+            <w:pPr>
+              <w:rPr>
+                <w:bCs/>
+              </w:rPr>
+            </w:pPr>
+            <w:r>
+              <w:rPr>
+                <w:bCs/>
+              </w:rPr>
+              <w:t>CAN</w:t>
+            </w:r>
+          </w:p>
+        </w:tc>
+      </w:tr>
+      <w:tr>
+        <w:tc>
+          <w:tcPr>
+            <w:tcW w:w="1980" w:type="dxa"/>
+            <w:tcBorders>
+              <w:bottom w:val="single" w:sz="4" w:space="0" w:color="auto"/>
+            </w:tcBorders>
+          </w:tcPr>
+          <w:p>
+            <w:pPr>
+              <w:jc w:val="center"/>
+              <w:rPr>
+                <w:bCs/>
+              </w:rPr>
+            </w:pPr>
+            <w:r>
+              <w:rPr>
+                <w:bCs/>
+              </w:rPr>
+              <w:t>5</w:t>
+            </w:r>
+          </w:p>
+        </w:tc>
+        <w:tc>
+          <w:tcPr>
+            <w:tcW w:w="7074" w:type="dxa"/>
+            <w:tcBorders>
+              <w:bottom w:val="single" w:sz="4" w:space="0" w:color="auto"/>
+            </w:tcBorders>
+          </w:tcPr>
+          <w:p>
+            <w:pPr>
+              <w:rPr>
+                <w:bCs/>
+                <w:lang w:val="en-US"/>
+              </w:rPr>
+            </w:pPr>
+            <w:r>
+              <w:rPr>
+                <w:bCs/>
+                <w:lang w:val="en-US"/>
+              </w:rPr>
+              <w:t>Volz CAN (old bootloader</w:t>
+            </w:r>
+            <w:r>
+              <w:rPr>
+                <w:bCs/>
+                <w:lang w:val="en-US"/>
+              </w:rPr>
+              <w:t>, the rest of the functionality is identical</w:t>
+            </w:r>
+            <w:r>
+              <w:rPr>
+                <w:bCs/>
+                <w:lang w:val="en-US"/>
+              </w:rPr>
+              <w:t>)</w:t>
+            </w:r>
+          </w:p>
+        </w:tc>
+      </w:tr>
+      <w:tr>
+        <w:tc>
+          <w:tcPr>
+            <w:tcW w:w="1980" w:type="dxa"/>
+            <w:shd w:val="clear" w:color="auto" w:fill="D9D9D9" w:themeFill="background1" w:themeFillShade="D9"/>
+          </w:tcPr>
+          <w:p>
+            <w:pPr>
+              <w:jc w:val="center"/>
+              <w:rPr>
+                <w:bCs/>
+              </w:rPr>
+            </w:pPr>
+            <w:r>
+              <w:rPr>
+                <w:bCs/>
+              </w:rPr>
+              <w:t>6</w:t>
+            </w:r>
+          </w:p>
+        </w:tc>
+        <w:tc>
+          <w:tcPr>
+            <w:tcW w:w="7074" w:type="dxa"/>
+            <w:shd w:val="clear" w:color="auto" w:fill="D9D9D9" w:themeFill="background1" w:themeFillShade="D9"/>
+          </w:tcPr>
+          <w:p>
+            <w:pPr>
+              <w:rPr>
+                <w:bCs/>
+              </w:rPr>
+            </w:pPr>
+            <w:r>
+              <w:rPr>
+                <w:bCs/>
+              </w:rPr>
+              <w:t>Amazon</w:t>
+            </w:r>
+          </w:p>
+        </w:tc>
+      </w:tr>
+      <w:tr>
+        <w:tc>
+          <w:tcPr>
+            <w:tcW w:w="1980" w:type="dxa"/>
+            <w:shd w:val="clear" w:color="auto" w:fill="D9D9D9" w:themeFill="background1" w:themeFillShade="D9"/>
+          </w:tcPr>
+          <w:p>
+            <w:pPr>
+              <w:jc w:val="center"/>
+              <w:rPr>
+                <w:bCs/>
+              </w:rPr>
+            </w:pPr>
+            <w:r>
+              <w:rPr>
+                <w:bCs/>
+              </w:rPr>
+              <w:t>7</w:t>
+            </w:r>
+          </w:p>
+        </w:tc>
+        <w:tc>
+          <w:tcPr>
+            <w:tcW w:w="7074" w:type="dxa"/>
+            <w:shd w:val="clear" w:color="auto" w:fill="D9D9D9" w:themeFill="background1" w:themeFillShade="D9"/>
+          </w:tcPr>
+          <w:p>
+            <w:pPr>
+              <w:rPr>
+                <w:bCs/>
+              </w:rPr>
+            </w:pPr>
+            <w:r>
+              <w:rPr>
+                <w:bCs/>
+              </w:rPr>
+              <w:t>SBus</w:t>
+            </w:r>
+          </w:p>
+        </w:tc>
+      </w:tr>
+      <w:tr>
+        <w:tc>
+          <w:tcPr>
+            <w:tcW w:w="1980" w:type="dxa"/>
+            <w:shd w:val="clear" w:color="auto" w:fill="D9D9D9" w:themeFill="background1" w:themeFillShade="D9"/>
+          </w:tcPr>
+          <w:p>
+            <w:pPr>
+              <w:jc w:val="center"/>
+              <w:rPr>
+                <w:bCs/>
+              </w:rPr>
+            </w:pPr>
+            <w:r>
+              <w:rPr>
+                <w:bCs/>
+              </w:rPr>
+              <w:t>8</w:t>
+            </w:r>
+          </w:p>
+        </w:tc>
+        <w:tc>
+          <w:tcPr>
+            <w:tcW w:w="7074" w:type="dxa"/>
+            <w:shd w:val="clear" w:color="auto" w:fill="D9D9D9" w:themeFill="background1" w:themeFillShade="D9"/>
+          </w:tcPr>
+          <w:p>
+            <w:pPr>
+              <w:rPr>
+                <w:bCs/>
+              </w:rPr>
+            </w:pPr>
+            <w:r>
+              <w:rPr>
+                <w:bCs/>
+              </w:rPr>
+              <w:t>UAVCAN_v0</w:t>
+            </w:r>
+          </w:p>
+        </w:tc>
+      </w:tr>
+      <w:tr>
+        <w:tc>
+          <w:tcPr>
+            <w:tcW w:w="1980" w:type="dxa"/>
+            <w:shd w:val="clear" w:color="auto" w:fill="D9D9D9" w:themeFill="background1" w:themeFillShade="D9"/>
+          </w:tcPr>
+          <w:p>
+            <w:pPr>
+              <w:jc w:val="center"/>
+              <w:rPr>
+                <w:bCs/>
+              </w:rPr>
+            </w:pPr>
+            <w:r>
+              <w:rPr>
+                <w:bCs/>
+              </w:rPr>
+              <w:t>9</w:t>
+            </w:r>
+          </w:p>
+        </w:tc>
+        <w:tc>
+          <w:tcPr>
+            <w:tcW w:w="7074" w:type="dxa"/>
+            <w:shd w:val="clear" w:color="auto" w:fill="D9D9D9" w:themeFill="background1" w:themeFillShade="D9"/>
+          </w:tcPr>
+          <w:p>
+            <w:pPr>
+              <w:rPr>
+                <w:bCs/>
+              </w:rPr>
+            </w:pPr>
+            <w:r>
+              <w:rPr>
+                <w:bCs/>
+              </w:rPr>
+              <w:t>Meteor CAN</w:t>
+            </w:r>
+          </w:p>
+        </w:tc>
+      </w:tr>
+    </w:tbl>
     <w:p>
       <w:pPr>
         <w:rPr>
@@ -5356,13 +6060,13 @@
         <w:tblLook w:val="04A0" w:firstRow="1" w:lastRow="0" w:firstColumn="1" w:lastColumn="0" w:noHBand="0" w:noVBand="1"/>
       </w:tblPr>
       <w:tblGrid>
-        <w:gridCol w:w="1838"/>
-        <w:gridCol w:w="7216"/>
+        <w:gridCol w:w="1980"/>
+        <w:gridCol w:w="7074"/>
       </w:tblGrid>
       <w:tr>
         <w:tc>
           <w:tcPr>
-            <w:tcW w:w="1838" w:type="dxa"/>
+            <w:tcW w:w="1980" w:type="dxa"/>
             <w:shd w:val="clear" w:color="auto" w:fill="D9D9D9" w:themeFill="background1" w:themeFillShade="D9"/>
           </w:tcPr>
           <w:p>
@@ -5370,18 +6074,26 @@
               <w:jc w:val="center"/>
               <w:rPr>
                 <w:b/>
+                <w:sz w:val="28"/>
+                <w:szCs w:val="28"/>
               </w:rPr>
             </w:pPr>
             <w:r>
               <w:rPr>
                 <w:b/>
               </w:rPr>
-              <w:t>Inter</w:t>
+              <w:t>Sub-I</w:t>
             </w:r>
             <w:r>
               <w:rPr>
                 <w:b/>
               </w:rPr>
+              <w:t>nter</w:t>
+            </w:r>
+            <w:r>
+              <w:rPr>
+                <w:b/>
+              </w:rPr>
               <w:t>f</w:t>
             </w:r>
             <w:r>
@@ -5394,7 +6106,7 @@
         </w:tc>
         <w:tc>
           <w:tcPr>
-            <w:tcW w:w="7216" w:type="dxa"/>
+            <w:tcW w:w="7074" w:type="dxa"/>
             <w:shd w:val="clear" w:color="auto" w:fill="D9D9D9" w:themeFill="background1" w:themeFillShade="D9"/>
           </w:tcPr>
           <w:p>
@@ -5402,6 +6114,8 @@
               <w:jc w:val="center"/>
               <w:rPr>
                 <w:b/>
+                <w:sz w:val="28"/>
+                <w:szCs w:val="28"/>
               </w:rPr>
             </w:pPr>
             <w:r>
@@ -5416,22 +6130,18 @@
       <w:tr>
         <w:tc>
           <w:tcPr>
-            <w:tcW w:w="1838" w:type="dxa"/>
+            <w:tcW w:w="1980" w:type="dxa"/>
           </w:tcPr>
           <w:p>
             <w:pPr>
               <w:jc w:val="center"/>
               <w:rPr>
                 <w:bCs/>
-                <w:sz w:val="28"/>
-                <w:szCs w:val="28"/>
-              </w:rPr>
-            </w:pPr>
-            <w:r>
-              <w:rPr>
-                <w:bCs/>
-                <w:sz w:val="28"/>
-                <w:szCs w:val="28"/>
+              </w:rPr>
+            </w:pPr>
+            <w:r>
+              <w:rPr>
+                <w:bCs/>
               </w:rPr>
               <w:t>0</w:t>
             </w:r>
@@ -5439,23 +6149,19 @@
         </w:tc>
         <w:tc>
           <w:tcPr>
-            <w:tcW w:w="7216" w:type="dxa"/>
-          </w:tcPr>
-          <w:p>
-            <w:pPr>
-              <w:rPr>
-                <w:bCs/>
-                <w:sz w:val="28"/>
-                <w:szCs w:val="28"/>
-              </w:rPr>
-            </w:pPr>
-            <w:r>
-              <w:rPr>
-                <w:bCs/>
-                <w:sz w:val="28"/>
-                <w:szCs w:val="28"/>
-              </w:rPr>
-              <w:t>PWM</w:t>
+            <w:tcW w:w="7074" w:type="dxa"/>
+          </w:tcPr>
+          <w:p>
+            <w:pPr>
+              <w:rPr>
+                <w:bCs/>
+              </w:rPr>
+            </w:pPr>
+            <w:r>
+              <w:rPr>
+                <w:bCs/>
+              </w:rPr>
+              <w:t>Standard RS485</w:t>
             </w:r>
           </w:p>
         </w:tc>
@@ -5463,22 +6169,18 @@
       <w:tr>
         <w:tc>
           <w:tcPr>
-            <w:tcW w:w="1838" w:type="dxa"/>
+            <w:tcW w:w="1980" w:type="dxa"/>
           </w:tcPr>
           <w:p>
             <w:pPr>
               <w:jc w:val="center"/>
               <w:rPr>
                 <w:bCs/>
-                <w:sz w:val="28"/>
-                <w:szCs w:val="28"/>
-              </w:rPr>
-            </w:pPr>
-            <w:r>
-              <w:rPr>
-                <w:bCs/>
-                <w:sz w:val="28"/>
-                <w:szCs w:val="28"/>
+              </w:rPr>
+            </w:pPr>
+            <w:r>
+              <w:rPr>
+                <w:bCs/>
               </w:rPr>
               <w:t>1</w:t>
             </w:r>
@@ -5486,23 +6188,21 @@
         </w:tc>
         <w:tc>
           <w:tcPr>
-            <w:tcW w:w="7216" w:type="dxa"/>
-          </w:tcPr>
-          <w:p>
-            <w:pPr>
-              <w:rPr>
-                <w:bCs/>
-                <w:sz w:val="28"/>
-                <w:szCs w:val="28"/>
-              </w:rPr>
-            </w:pPr>
-            <w:r>
-              <w:rPr>
-                <w:bCs/>
-                <w:sz w:val="28"/>
-                <w:szCs w:val="28"/>
-              </w:rPr>
-              <w:t>RS485</w:t>
+            <w:tcW w:w="7074" w:type="dxa"/>
+          </w:tcPr>
+          <w:p>
+            <w:pPr>
+              <w:rPr>
+                <w:bCs/>
+                <w:lang w:val="en-US"/>
+              </w:rPr>
+            </w:pPr>
+            <w:r>
+              <w:rPr>
+                <w:bCs/>
+                <w:lang w:val="en-US"/>
+              </w:rPr>
+              <w:t>DA22 RS485</w:t>
             </w:r>
           </w:p>
         </w:tc>
@@ -5510,22 +6210,18 @@
       <w:tr>
         <w:tc>
           <w:tcPr>
-            <w:tcW w:w="1838" w:type="dxa"/>
+            <w:tcW w:w="1980" w:type="dxa"/>
           </w:tcPr>
           <w:p>
             <w:pPr>
               <w:jc w:val="center"/>
               <w:rPr>
                 <w:bCs/>
-                <w:sz w:val="28"/>
-                <w:szCs w:val="28"/>
-              </w:rPr>
-            </w:pPr>
-            <w:r>
-              <w:rPr>
-                <w:bCs/>
-                <w:sz w:val="28"/>
-                <w:szCs w:val="28"/>
+              </w:rPr>
+            </w:pPr>
+            <w:r>
+              <w:rPr>
+                <w:bCs/>
               </w:rPr>
               <w:t>2</w:t>
             </w:r>
@@ -5533,21 +6229,18 @@
         </w:tc>
         <w:tc>
           <w:tcPr>
-            <w:tcW w:w="7216" w:type="dxa"/>
-          </w:tcPr>
-          <w:p>
-            <w:pPr>
-              <w:rPr>
-                <w:bCs/>
-                <w:sz w:val="28"/>
-                <w:szCs w:val="28"/>
-              </w:rPr>
-            </w:pPr>
-            <w:r>
-              <w:rPr>
-                <w:bCs/>
-                <w:sz w:val="28"/>
-                <w:szCs w:val="28"/>
+            <w:tcW w:w="7074" w:type="dxa"/>
+          </w:tcPr>
+          <w:p>
+            <w:pPr>
+              <w:rPr>
+                <w:bCs/>
+              </w:rPr>
+            </w:pPr>
+            <w:r>
+              <w:rPr>
+                <w:bCs/>
+                <w:lang w:val="en-US"/>
               </w:rPr>
               <w:t>RS485 for big actuators</w:t>
             </w:r>
@@ -5557,22 +6250,18 @@
       <w:tr>
         <w:tc>
           <w:tcPr>
-            <w:tcW w:w="1838" w:type="dxa"/>
+            <w:tcW w:w="1980" w:type="dxa"/>
           </w:tcPr>
           <w:p>
             <w:pPr>
               <w:jc w:val="center"/>
               <w:rPr>
                 <w:bCs/>
-                <w:sz w:val="28"/>
-                <w:szCs w:val="28"/>
-              </w:rPr>
-            </w:pPr>
-            <w:r>
-              <w:rPr>
-                <w:bCs/>
-                <w:sz w:val="28"/>
-                <w:szCs w:val="28"/>
+              </w:rPr>
+            </w:pPr>
+            <w:r>
+              <w:rPr>
+                <w:bCs/>
               </w:rPr>
               <w:t>3</w:t>
             </w:r>
@@ -5580,46 +6269,74 @@
         </w:tc>
         <w:tc>
           <w:tcPr>
-            <w:tcW w:w="7216" w:type="dxa"/>
-          </w:tcPr>
-          <w:p>
-            <w:pPr>
-              <w:rPr>
-                <w:bCs/>
-                <w:sz w:val="28"/>
-                <w:szCs w:val="28"/>
-              </w:rPr>
-            </w:pPr>
-            <w:r>
-              <w:rPr>
-                <w:bCs/>
-                <w:sz w:val="28"/>
-                <w:szCs w:val="28"/>
-              </w:rPr>
-              <w:t>RS485 for new actuators</w:t>
-            </w:r>
+            <w:tcW w:w="7074" w:type="dxa"/>
+          </w:tcPr>
+          <w:p>
+            <w:pPr>
+              <w:rPr>
+                <w:bCs/>
+              </w:rPr>
+            </w:pPr>
+            <w:r>
+              <w:rPr>
+                <w:bCs/>
+              </w:rPr>
+              <w:t xml:space="preserve">RS485 </w:t>
+            </w:r>
+            <w:proofErr w:type="spellStart"/>
+            <w:r>
+              <w:rPr>
+                <w:bCs/>
+              </w:rPr>
+              <w:t>for</w:t>
+            </w:r>
+            <w:proofErr w:type="spellEnd"/>
+            <w:r>
+              <w:rPr>
+                <w:bCs/>
+              </w:rPr>
+              <w:t xml:space="preserve"> </w:t>
+            </w:r>
+            <w:proofErr w:type="spellStart"/>
+            <w:r>
+              <w:rPr>
+                <w:bCs/>
+              </w:rPr>
+              <w:t>new</w:t>
+            </w:r>
+            <w:proofErr w:type="spellEnd"/>
+            <w:r>
+              <w:rPr>
+                <w:bCs/>
+              </w:rPr>
+              <w:t xml:space="preserve"> </w:t>
+            </w:r>
+            <w:proofErr w:type="spellStart"/>
+            <w:r>
+              <w:rPr>
+                <w:bCs/>
+              </w:rPr>
+              <w:t>actuators</w:t>
+            </w:r>
+            <w:proofErr w:type="spellEnd"/>
           </w:p>
         </w:tc>
       </w:tr>
       <w:tr>
         <w:tc>
           <w:tcPr>
-            <w:tcW w:w="1838" w:type="dxa"/>
+            <w:tcW w:w="1980" w:type="dxa"/>
           </w:tcPr>
           <w:p>
             <w:pPr>
               <w:jc w:val="center"/>
               <w:rPr>
                 <w:bCs/>
-                <w:sz w:val="28"/>
-                <w:szCs w:val="28"/>
-              </w:rPr>
-            </w:pPr>
-            <w:r>
-              <w:rPr>
-                <w:bCs/>
-                <w:sz w:val="28"/>
-                <w:szCs w:val="28"/>
+              </w:rPr>
+            </w:pPr>
+            <w:r>
+              <w:rPr>
+                <w:bCs/>
               </w:rPr>
               <w:t>4</w:t>
             </w:r>
@@ -5627,292 +6344,19 @@
         </w:tc>
         <w:tc>
           <w:tcPr>
-            <w:tcW w:w="7216" w:type="dxa"/>
-          </w:tcPr>
-          <w:p>
-            <w:pPr>
-              <w:rPr>
-                <w:bCs/>
-                <w:sz w:val="28"/>
-                <w:szCs w:val="28"/>
-              </w:rPr>
-            </w:pPr>
-            <w:r>
-              <w:rPr>
-                <w:bCs/>
-                <w:sz w:val="28"/>
-                <w:szCs w:val="28"/>
-              </w:rPr>
-              <w:t>Volz CAN</w:t>
-            </w:r>
-          </w:p>
-        </w:tc>
-      </w:tr>
-      <w:tr>
-        <w:tc>
-          <w:tcPr>
-            <w:tcW w:w="1838" w:type="dxa"/>
-            <w:tcBorders>
-              <w:bottom w:val="single" w:sz="4" w:space="0" w:color="auto"/>
-            </w:tcBorders>
-          </w:tcPr>
-          <w:p>
-            <w:pPr>
-              <w:jc w:val="center"/>
-              <w:rPr>
-                <w:bCs/>
-                <w:sz w:val="28"/>
-                <w:szCs w:val="28"/>
-              </w:rPr>
-            </w:pPr>
-            <w:r>
-              <w:rPr>
-                <w:bCs/>
-                <w:sz w:val="28"/>
-                <w:szCs w:val="28"/>
-              </w:rPr>
-              <w:t>5</w:t>
-            </w:r>
-          </w:p>
-        </w:tc>
-        <w:tc>
-          <w:tcPr>
-            <w:tcW w:w="7216" w:type="dxa"/>
-            <w:tcBorders>
-              <w:bottom w:val="single" w:sz="4" w:space="0" w:color="auto"/>
-            </w:tcBorders>
-          </w:tcPr>
-          <w:p>
-            <w:pPr>
-              <w:rPr>
-                <w:bCs/>
-                <w:sz w:val="28"/>
-                <w:szCs w:val="28"/>
-                <w:lang w:val="en-US"/>
-              </w:rPr>
-            </w:pPr>
-            <w:r>
-              <w:rPr>
-                <w:bCs/>
-                <w:sz w:val="28"/>
-                <w:szCs w:val="28"/>
-                <w:lang w:val="en-US"/>
-              </w:rPr>
-              <w:t>Volz CAN (old bootloader</w:t>
-            </w:r>
-            <w:r>
-              <w:rPr>
-                <w:bCs/>
-                <w:sz w:val="28"/>
-                <w:szCs w:val="28"/>
-                <w:lang w:val="en-US"/>
-              </w:rPr>
-              <w:t>, the rest of the functionality is identical</w:t>
-            </w:r>
-            <w:r>
-              <w:rPr>
-                <w:bCs/>
-                <w:sz w:val="28"/>
-                <w:szCs w:val="28"/>
-                <w:lang w:val="en-US"/>
-              </w:rPr>
-              <w:t>)</w:t>
-            </w:r>
-          </w:p>
-        </w:tc>
-      </w:tr>
-      <w:tr>
-        <w:tc>
-          <w:tcPr>
-            <w:tcW w:w="1838" w:type="dxa"/>
-            <w:shd w:val="clear" w:color="auto" w:fill="D9D9D9" w:themeFill="background1" w:themeFillShade="D9"/>
-          </w:tcPr>
-          <w:p>
-            <w:pPr>
-              <w:jc w:val="center"/>
-              <w:rPr>
-                <w:bCs/>
-                <w:sz w:val="28"/>
-                <w:szCs w:val="28"/>
-              </w:rPr>
-            </w:pPr>
-            <w:r>
-              <w:rPr>
-                <w:bCs/>
-                <w:sz w:val="28"/>
-                <w:szCs w:val="28"/>
-              </w:rPr>
-              <w:t>6</w:t>
-            </w:r>
-          </w:p>
-        </w:tc>
-        <w:tc>
-          <w:tcPr>
-            <w:tcW w:w="7216" w:type="dxa"/>
-            <w:shd w:val="clear" w:color="auto" w:fill="D9D9D9" w:themeFill="background1" w:themeFillShade="D9"/>
-          </w:tcPr>
-          <w:p>
-            <w:pPr>
-              <w:rPr>
-                <w:bCs/>
-                <w:sz w:val="28"/>
-                <w:szCs w:val="28"/>
-              </w:rPr>
-            </w:pPr>
-            <w:r>
-              <w:rPr>
-                <w:bCs/>
-                <w:sz w:val="28"/>
-                <w:szCs w:val="28"/>
-              </w:rPr>
-              <w:t>Amazon</w:t>
-            </w:r>
-          </w:p>
-        </w:tc>
-      </w:tr>
-      <w:tr>
-        <w:tc>
-          <w:tcPr>
-            <w:tcW w:w="1838" w:type="dxa"/>
-            <w:shd w:val="clear" w:color="auto" w:fill="D9D9D9" w:themeFill="background1" w:themeFillShade="D9"/>
-          </w:tcPr>
-          <w:p>
-            <w:pPr>
-              <w:jc w:val="center"/>
-              <w:rPr>
-                <w:bCs/>
-                <w:sz w:val="28"/>
-                <w:szCs w:val="28"/>
-              </w:rPr>
-            </w:pPr>
-            <w:r>
-              <w:rPr>
-                <w:bCs/>
-                <w:sz w:val="28"/>
-                <w:szCs w:val="28"/>
-              </w:rPr>
-              <w:t>7</w:t>
-            </w:r>
-          </w:p>
-        </w:tc>
-        <w:tc>
-          <w:tcPr>
-            <w:tcW w:w="7216" w:type="dxa"/>
-            <w:shd w:val="clear" w:color="auto" w:fill="D9D9D9" w:themeFill="background1" w:themeFillShade="D9"/>
-          </w:tcPr>
-          <w:p>
-            <w:pPr>
-              <w:rPr>
-                <w:bCs/>
-                <w:sz w:val="28"/>
-                <w:szCs w:val="28"/>
-              </w:rPr>
-            </w:pPr>
-            <w:r>
-              <w:rPr>
-                <w:bCs/>
-                <w:sz w:val="28"/>
-                <w:szCs w:val="28"/>
-              </w:rPr>
-              <w:t>SBus</w:t>
-            </w:r>
-          </w:p>
-        </w:tc>
-      </w:tr>
-      <w:tr>
-        <w:tc>
-          <w:tcPr>
-            <w:tcW w:w="1838" w:type="dxa"/>
-            <w:shd w:val="clear" w:color="auto" w:fill="D9D9D9" w:themeFill="background1" w:themeFillShade="D9"/>
-          </w:tcPr>
-          <w:p>
-            <w:pPr>
-              <w:jc w:val="center"/>
-              <w:rPr>
-                <w:bCs/>
-                <w:sz w:val="28"/>
-                <w:szCs w:val="28"/>
-              </w:rPr>
-            </w:pPr>
-            <w:r>
-              <w:rPr>
-                <w:bCs/>
-                <w:sz w:val="28"/>
-                <w:szCs w:val="28"/>
-              </w:rPr>
-              <w:t>8</w:t>
-            </w:r>
-          </w:p>
-        </w:tc>
-        <w:tc>
-          <w:tcPr>
-            <w:tcW w:w="7216" w:type="dxa"/>
-            <w:shd w:val="clear" w:color="auto" w:fill="D9D9D9" w:themeFill="background1" w:themeFillShade="D9"/>
-          </w:tcPr>
-          <w:p>
-            <w:pPr>
-              <w:rPr>
-                <w:bCs/>
-                <w:sz w:val="28"/>
-                <w:szCs w:val="28"/>
-              </w:rPr>
-            </w:pPr>
-            <w:r>
-              <w:rPr>
-                <w:bCs/>
-                <w:sz w:val="28"/>
-                <w:szCs w:val="28"/>
-              </w:rPr>
-              <w:t>UAVCAN_v0</w:t>
-            </w:r>
-          </w:p>
-        </w:tc>
-      </w:tr>
-      <w:tr>
-        <w:tc>
-          <w:tcPr>
-            <w:tcW w:w="1838" w:type="dxa"/>
-            <w:shd w:val="clear" w:color="auto" w:fill="D9D9D9" w:themeFill="background1" w:themeFillShade="D9"/>
-          </w:tcPr>
-          <w:p>
-            <w:pPr>
-              <w:jc w:val="center"/>
-              <w:rPr>
-                <w:bCs/>
-                <w:sz w:val="28"/>
-                <w:szCs w:val="28"/>
-              </w:rPr>
-            </w:pPr>
-            <w:r>
-              <w:rPr>
-                <w:bCs/>
-                <w:sz w:val="28"/>
-                <w:szCs w:val="28"/>
-              </w:rPr>
-              <w:t>9</w:t>
-            </w:r>
-          </w:p>
-        </w:tc>
-        <w:tc>
-          <w:tcPr>
-            <w:tcW w:w="7216" w:type="dxa"/>
-            <w:shd w:val="clear" w:color="auto" w:fill="D9D9D9" w:themeFill="background1" w:themeFillShade="D9"/>
-          </w:tcPr>
-          <w:p>
-            <w:pPr>
-              <w:rPr>
-                <w:bCs/>
-                <w:sz w:val="28"/>
-                <w:szCs w:val="28"/>
-              </w:rPr>
-            </w:pPr>
-            <w:r>
-              <w:rPr>
-                <w:bCs/>
-                <w:sz w:val="28"/>
-                <w:szCs w:val="28"/>
-              </w:rPr>
-              <w:t>Meteor CAN</w:t>
+            <w:tcW w:w="7074" w:type="dxa"/>
+          </w:tcPr>
+          <w:p>
+            <w:pPr>
+              <w:rPr>
+                <w:bCs/>
+              </w:rPr>
+            </w:pPr>
+            <w:r>
+              <w:rPr>
+                <w:bCs/>
+              </w:rPr>
+              <w:t>Schiebel RS485</w:t>
             </w:r>
           </w:p>
         </w:tc>

</xml_diff>